<commit_message>
Real-program, slow-disk, policy and second-machine results with significance tests
- Slow disk: the earlier run used 10 ms of think time, not 100 ms (the flag was never passed);
  log renamed, both settings rerun. 10 ms: p99 +131% (p=0.006); 100 ms: no effect.
- Real programs (PostgreSQL build, grep, Python start-up): the daemon slows them 10-109%;
  their files stay cached, so only its cost remains.
- Dead-file eviction: +5% throughput over prefetching alone (p=0.004), +38% over Linux;
  repeated on a 2 vCPU / 4 GB machine (+6%, p=0.004). OOM-killed on real programs at 300 MB.
- Adaptive I/O limit: removes the busy-disk tail cost only by switching prefetching off.
- docs/statistics.md: Welch tests for every log; two earlier claims were not significant.
- docs/evaluation_v3.md, README, report and website updated; raw logs added.
</commit_message>
<xml_diff>
--- a/report/Project_Report.docx
+++ b/report/Project_Report.docx
@@ -1762,6 +1762,96 @@
         <w:rPr>
           <w:b/>
         </w:rPr>
+        <w:t xml:space="preserve">Real applications:</w:t>
+      </w:r>
+      <w:r>
+        <w:rPr/>
+        <w:t xml:space="preserve"> three real programs on the PostgreSQL source tree, each repeating one task: a build of two of its libraries (</w:t>
+      </w:r>
+      <w:r>
+        <w:rPr>
+          <w:rFonts w:ascii="Courier New" w:hAnsi="Courier New"/>
+        </w:rPr>
+        <w:t xml:space="preserve">make</w:t>
+      </w:r>
+      <w:r>
+        <w:rPr/>
+        <w:t xml:space="preserve"> of </w:t>
+      </w:r>
+      <w:r>
+        <w:rPr>
+          <w:rFonts w:ascii="Courier New" w:hAnsi="Courier New"/>
+        </w:rPr>
+        <w:t xml:space="preserve">src/port</w:t>
+      </w:r>
+      <w:r>
+        <w:rPr/>
+        <w:t xml:space="preserve"> and </w:t>
+      </w:r>
+      <w:r>
+        <w:rPr>
+          <w:rFonts w:ascii="Courier New" w:hAnsi="Courier New"/>
+        </w:rPr>
+        <w:t xml:space="preserve">src/common</w:t>
+      </w:r>
+      <w:r>
+        <w:rPr/>
+        <w:t xml:space="preserve">), a search (</w:t>
+      </w:r>
+      <w:r>
+        <w:rPr>
+          <w:rFonts w:ascii="Courier New" w:hAnsi="Courier New"/>
+        </w:rPr>
+        <w:t xml:space="preserve">grep -rn</w:t>
+      </w:r>
+      <w:r>
+        <w:rPr/>
+        <w:t xml:space="preserve"> and </w:t>
+      </w:r>
+      <w:r>
+        <w:rPr>
+          <w:rFonts w:ascii="Courier New" w:hAnsi="Courier New"/>
+        </w:rPr>
+        <w:t xml:space="preserve">git grep</w:t>
+      </w:r>
+      <w:r>
+        <w:rPr/>
+        <w:t xml:space="preserve"> over </w:t>
+      </w:r>
+      <w:r>
+        <w:rPr>
+          <w:rFonts w:ascii="Courier New" w:hAnsi="Courier New"/>
+        </w:rPr>
+        <w:t xml:space="preserve">src/backend</w:t>
+      </w:r>
+      <w:r>
+        <w:rPr/>
+        <w:t xml:space="preserve">), and a Python start-up importing twenty standard-library modules. The metric is time per operation (</w:t>
+      </w:r>
+      <w:r>
+        <w:rPr>
+          <w:rFonts w:ascii="Courier New" w:hAnsi="Courier New"/>
+        </w:rPr>
+        <w:t xml:space="preserve">realapps.py</w:t>
+      </w:r>
+      <w:r>
+        <w:rPr/>
+        <w:t xml:space="preserve">).</w:t>
+      </w:r>
+    </w:p>
+    <w:p>
+      <w:pPr>
+        <w:ind w:left="540" w:hanging="270"/>
+        <w:spacing w:after="60"/>
+      </w:pPr>
+      <w:r>
+        <w:rPr/>
+        <w:t xml:space="preserve">•  </w:t>
+      </w:r>
+      <w:r>
+        <w:rPr>
+          <w:b/>
+        </w:rPr>
         <w:t xml:space="preserve">Real data:</w:t>
       </w:r>
       <w:r>
@@ -1924,6 +2014,46 @@
       <w:r>
         <w:rPr/>
         <w:t xml:space="preserve"> the share of prefetched files that were read within two seconds. This is the daemon's own estimate and is *not* evidence that pages are resident (see Section 6.1).</w:t>
+      </w:r>
+    </w:p>
+    <w:p>
+      <w:pPr>
+        <w:ind w:left="540" w:hanging="270"/>
+        <w:spacing w:after="60"/>
+      </w:pPr>
+      <w:r>
+        <w:rPr/>
+        <w:t xml:space="preserve">•  </w:t>
+      </w:r>
+      <w:r>
+        <w:rPr>
+          <w:b/>
+        </w:rPr>
+        <w:t xml:space="preserve">Statistics:</w:t>
+      </w:r>
+      <w:r>
+        <w:rPr/>
+        <w:t xml:space="preserve"> each configuration is compared with no daemon using per-run values. The report gives the difference of means with a 95% confidence interval and the p-value of a two-sided Welch's t-test (</w:t>
+      </w:r>
+      <w:r>
+        <w:rPr>
+          <w:rFonts w:ascii="Courier New" w:hAnsi="Courier New"/>
+        </w:rPr>
+        <w:t xml:space="preserve">stats.py</w:t>
+      </w:r>
+      <w:r>
+        <w:rPr/>
+        <w:t xml:space="preserve">). With four or five runs, a difference is treated as real only when p &lt; 0.05. The full tables are in </w:t>
+      </w:r>
+      <w:r>
+        <w:rPr>
+          <w:rFonts w:ascii="Courier New" w:hAnsi="Courier New"/>
+        </w:rPr>
+        <w:t xml:space="preserve">docs/statistics.md</w:t>
+      </w:r>
+      <w:r>
+        <w:rPr/>
+        <w:t xml:space="preserve">.</w:t>
       </w:r>
     </w:p>
     <w:p>
@@ -3116,7 +3246,7 @@
       </w:pPr>
       <w:r>
         <w:rPr/>
-        <w:t xml:space="preserve">The disk was capped at 400 MB/s, each file was followed by 100 ms of think time (idle time in which prefetching could overlap), and a 9 GB ballast was used. Four runs per configuration:</w:t>
+        <w:t xml:space="preserve">The disk was capped at 400 MB/s and a 9 GB ballast left about 2.5 GB of cache for a 4 GB working set. This experiment was first reported as using 100 ms of think time after each file, but the harness did not pass that setting to the workload, so it actually used the 10 ms default. The bug was fixed and both settings were measured again, four runs per configuration:</w:t>
       </w:r>
     </w:p>
     <w:tbl>
@@ -3285,7 +3415,7 @@
               <w:rPr>
                 <w:sz w:val="19"/>
               </w:rPr>
-              <w:t xml:space="preserve">No daemon</w:t>
+              <w:t xml:space="preserve">100 ms think, no daemon</w:t>
             </w:r>
           </w:p>
         </w:tc>
@@ -3301,7 +3431,7 @@
               <w:rPr>
                 <w:sz w:val="19"/>
               </w:rPr>
-              <w:t xml:space="preserve">1.1% ± 0.2</w:t>
+              <w:t xml:space="preserve">25.5% ± 1.3</w:t>
             </w:r>
           </w:p>
         </w:tc>
@@ -3317,55 +3447,55 @@
               <w:rPr>
                 <w:sz w:val="19"/>
               </w:rPr>
-              <w:t xml:space="preserve">2319</w:t>
-            </w:r>
-          </w:p>
-        </w:tc>
-        <w:tc>
-          <w:tcPr>
-            <w:tcW w:w="800" w:type="dxa"/>
-          </w:tcPr>
-          <w:p>
-            <w:pPr>
-              <w:spacing w:after="0"/>
-            </w:pPr>
-            <w:r>
-              <w:rPr>
-                <w:sz w:val="19"/>
-              </w:rPr>
-              <w:t xml:space="preserve">79.5</w:t>
-            </w:r>
-          </w:p>
-        </w:tc>
-        <w:tc>
-          <w:tcPr>
-            <w:tcW w:w="800" w:type="dxa"/>
-          </w:tcPr>
-          <w:p>
-            <w:pPr>
-              <w:spacing w:after="0"/>
-            </w:pPr>
-            <w:r>
-              <w:rPr>
-                <w:sz w:val="19"/>
-              </w:rPr>
-              <w:t xml:space="preserve">94.4</w:t>
-            </w:r>
-          </w:p>
-        </w:tc>
-        <w:tc>
-          <w:tcPr>
-            <w:tcW w:w="800" w:type="dxa"/>
-          </w:tcPr>
-          <w:p>
-            <w:pPr>
-              <w:spacing w:after="0"/>
-            </w:pPr>
-            <w:r>
-              <w:rPr>
-                <w:sz w:val="19"/>
-              </w:rPr>
-              <w:t xml:space="preserve">97.8</w:t>
+              <w:t xml:space="preserve">1588</w:t>
+            </w:r>
+          </w:p>
+        </w:tc>
+        <w:tc>
+          <w:tcPr>
+            <w:tcW w:w="800" w:type="dxa"/>
+          </w:tcPr>
+          <w:p>
+            <w:pPr>
+              <w:spacing w:after="0"/>
+            </w:pPr>
+            <w:r>
+              <w:rPr>
+                <w:sz w:val="19"/>
+              </w:rPr>
+              <w:t xml:space="preserve">9.8</w:t>
+            </w:r>
+          </w:p>
+        </w:tc>
+        <w:tc>
+          <w:tcPr>
+            <w:tcW w:w="800" w:type="dxa"/>
+          </w:tcPr>
+          <w:p>
+            <w:pPr>
+              <w:spacing w:after="0"/>
+            </w:pPr>
+            <w:r>
+              <w:rPr>
+                <w:sz w:val="19"/>
+              </w:rPr>
+              <w:t xml:space="preserve">14.1</w:t>
+            </w:r>
+          </w:p>
+        </w:tc>
+        <w:tc>
+          <w:tcPr>
+            <w:tcW w:w="800" w:type="dxa"/>
+          </w:tcPr>
+          <w:p>
+            <w:pPr>
+              <w:spacing w:after="0"/>
+            </w:pPr>
+            <w:r>
+              <w:rPr>
+                <w:sz w:val="19"/>
+              </w:rPr>
+              <w:t xml:space="preserve">15.9</w:t>
             </w:r>
           </w:p>
         </w:tc>
@@ -3393,7 +3523,7 @@
               <w:rPr>
                 <w:sz w:val="19"/>
               </w:rPr>
-              <w:t xml:space="preserve">Daemon, throttle on</w:t>
+              <w:t xml:space="preserve">100 ms think, daemon</w:t>
             </w:r>
           </w:p>
         </w:tc>
@@ -3409,7 +3539,7 @@
               <w:rPr>
                 <w:sz w:val="19"/>
               </w:rPr>
-              <w:t xml:space="preserve">1.2% ± 0.4</w:t>
+              <w:t xml:space="preserve">74.7% ± 0.5</w:t>
             </w:r>
           </w:p>
         </w:tc>
@@ -3425,55 +3555,55 @@
               <w:rPr>
                 <w:sz w:val="19"/>
               </w:rPr>
-              <w:t xml:space="preserve">2311</w:t>
-            </w:r>
-          </w:p>
-        </w:tc>
-        <w:tc>
-          <w:tcPr>
-            <w:tcW w:w="800" w:type="dxa"/>
-          </w:tcPr>
-          <w:p>
-            <w:pPr>
-              <w:spacing w:after="0"/>
-            </w:pPr>
-            <w:r>
-              <w:rPr>
-                <w:sz w:val="19"/>
-              </w:rPr>
-              <w:t xml:space="preserve">80.1</w:t>
-            </w:r>
-          </w:p>
-        </w:tc>
-        <w:tc>
-          <w:tcPr>
-            <w:tcW w:w="800" w:type="dxa"/>
-          </w:tcPr>
-          <w:p>
-            <w:pPr>
-              <w:spacing w:after="0"/>
-            </w:pPr>
-            <w:r>
-              <w:rPr>
-                <w:sz w:val="19"/>
-              </w:rPr>
-              <w:t xml:space="preserve">93.9</w:t>
-            </w:r>
-          </w:p>
-        </w:tc>
-        <w:tc>
-          <w:tcPr>
-            <w:tcW w:w="800" w:type="dxa"/>
-          </w:tcPr>
-          <w:p>
-            <w:pPr>
-              <w:spacing w:after="0"/>
-            </w:pPr>
-            <w:r>
-              <w:rPr>
-                <w:sz w:val="19"/>
-              </w:rPr>
-              <w:t xml:space="preserve">97.5</w:t>
+              <w:t xml:space="preserve">1600</w:t>
+            </w:r>
+          </w:p>
+        </w:tc>
+        <w:tc>
+          <w:tcPr>
+            <w:tcW w:w="800" w:type="dxa"/>
+          </w:tcPr>
+          <w:p>
+            <w:pPr>
+              <w:spacing w:after="0"/>
+            </w:pPr>
+            <w:r>
+              <w:rPr>
+                <w:sz w:val="19"/>
+              </w:rPr>
+              <w:t xml:space="preserve">8.9</w:t>
+            </w:r>
+          </w:p>
+        </w:tc>
+        <w:tc>
+          <w:tcPr>
+            <w:tcW w:w="800" w:type="dxa"/>
+          </w:tcPr>
+          <w:p>
+            <w:pPr>
+              <w:spacing w:after="0"/>
+            </w:pPr>
+            <w:r>
+              <w:rPr>
+                <w:sz w:val="19"/>
+              </w:rPr>
+              <w:t xml:space="preserve">14.0</w:t>
+            </w:r>
+          </w:p>
+        </w:tc>
+        <w:tc>
+          <w:tcPr>
+            <w:tcW w:w="800" w:type="dxa"/>
+          </w:tcPr>
+          <w:p>
+            <w:pPr>
+              <w:spacing w:after="0"/>
+            </w:pPr>
+            <w:r>
+              <w:rPr>
+                <w:sz w:val="19"/>
+              </w:rPr>
+              <w:t xml:space="preserve">15.6</w:t>
             </w:r>
           </w:p>
         </w:tc>
@@ -3489,7 +3619,7 @@
               <w:rPr>
                 <w:sz w:val="19"/>
               </w:rPr>
-              <w:t xml:space="preserve">26 (96.2%)</w:t>
+              <w:t xml:space="preserve">1175 (99.6%)</w:t>
             </w:r>
           </w:p>
         </w:tc>
@@ -3507,7 +3637,7 @@
               <w:rPr>
                 <w:sz w:val="19"/>
               </w:rPr>
-              <w:t xml:space="preserve">Daemon, no throttle</w:t>
+              <w:t xml:space="preserve">100 ms think, adaptive limit</w:t>
             </w:r>
           </w:p>
         </w:tc>
@@ -3523,7 +3653,7 @@
               <w:rPr>
                 <w:sz w:val="19"/>
               </w:rPr>
-              <w:t xml:space="preserve">43.8% ± 1.6</w:t>
+              <w:t xml:space="preserve">74.5% ± 0.4</w:t>
             </w:r>
           </w:p>
         </w:tc>
@@ -3539,55 +3669,55 @@
               <w:rPr>
                 <w:sz w:val="19"/>
               </w:rPr>
-              <w:t xml:space="preserve">2443</w:t>
-            </w:r>
-          </w:p>
-        </w:tc>
-        <w:tc>
-          <w:tcPr>
-            <w:tcW w:w="800" w:type="dxa"/>
-          </w:tcPr>
-          <w:p>
-            <w:pPr>
-              <w:spacing w:after="0"/>
-            </w:pPr>
-            <w:r>
-              <w:rPr>
-                <w:sz w:val="19"/>
-              </w:rPr>
-              <w:t xml:space="preserve">73.5</w:t>
-            </w:r>
-          </w:p>
-        </w:tc>
-        <w:tc>
-          <w:tcPr>
-            <w:tcW w:w="800" w:type="dxa"/>
-          </w:tcPr>
-          <w:p>
-            <w:pPr>
-              <w:spacing w:after="0"/>
-            </w:pPr>
-            <w:r>
-              <w:rPr>
-                <w:sz w:val="19"/>
-              </w:rPr>
-              <w:t xml:space="preserve">167.4</w:t>
-            </w:r>
-          </w:p>
-        </w:tc>
-        <w:tc>
-          <w:tcPr>
-            <w:tcW w:w="800" w:type="dxa"/>
-          </w:tcPr>
-          <w:p>
-            <w:pPr>
-              <w:spacing w:after="0"/>
-            </w:pPr>
-            <w:r>
-              <w:rPr>
-                <w:sz w:val="19"/>
-              </w:rPr>
-              <w:t xml:space="preserve">285.6</w:t>
+              <w:t xml:space="preserve">1588</w:t>
+            </w:r>
+          </w:p>
+        </w:tc>
+        <w:tc>
+          <w:tcPr>
+            <w:tcW w:w="800" w:type="dxa"/>
+          </w:tcPr>
+          <w:p>
+            <w:pPr>
+              <w:spacing w:after="0"/>
+            </w:pPr>
+            <w:r>
+              <w:rPr>
+                <w:sz w:val="19"/>
+              </w:rPr>
+              <w:t xml:space="preserve">9.8</w:t>
+            </w:r>
+          </w:p>
+        </w:tc>
+        <w:tc>
+          <w:tcPr>
+            <w:tcW w:w="800" w:type="dxa"/>
+          </w:tcPr>
+          <w:p>
+            <w:pPr>
+              <w:spacing w:after="0"/>
+            </w:pPr>
+            <w:r>
+              <w:rPr>
+                <w:sz w:val="19"/>
+              </w:rPr>
+              <w:t xml:space="preserve">14.4</w:t>
+            </w:r>
+          </w:p>
+        </w:tc>
+        <w:tc>
+          <w:tcPr>
+            <w:tcW w:w="800" w:type="dxa"/>
+          </w:tcPr>
+          <w:p>
+            <w:pPr>
+              <w:spacing w:after="0"/>
+            </w:pPr>
+            <w:r>
+              <w:rPr>
+                <w:sz w:val="19"/>
+              </w:rPr>
+              <w:t xml:space="preserve">16.2</w:t>
             </w:r>
           </w:p>
         </w:tc>
@@ -3603,7 +3733,343 @@
               <w:rPr>
                 <w:sz w:val="19"/>
               </w:rPr>
-              <w:t xml:space="preserve">1924 (99.3%)</w:t>
+              <w:t xml:space="preserve">1176 (99.3%)</w:t>
+            </w:r>
+          </w:p>
+        </w:tc>
+      </w:tr>
+      <w:tr>
+        <w:tc>
+          <w:tcPr>
+            <w:tcW w:w="2300" w:type="dxa"/>
+          </w:tcPr>
+          <w:p>
+            <w:pPr>
+              <w:spacing w:after="0"/>
+            </w:pPr>
+            <w:r>
+              <w:rPr>
+                <w:sz w:val="19"/>
+              </w:rPr>
+              <w:t xml:space="preserve">10 ms think, no daemon</w:t>
+            </w:r>
+          </w:p>
+        </w:tc>
+        <w:tc>
+          <w:tcPr>
+            <w:tcW w:w="1150" w:type="dxa"/>
+          </w:tcPr>
+          <w:p>
+            <w:pPr>
+              <w:spacing w:after="0"/>
+            </w:pPr>
+            <w:r>
+              <w:rPr>
+                <w:sz w:val="19"/>
+              </w:rPr>
+              <w:t xml:space="preserve">34.4% ± 0.8</w:t>
+            </w:r>
+          </w:p>
+        </w:tc>
+        <w:tc>
+          <w:tcPr>
+            <w:tcW w:w="950" w:type="dxa"/>
+          </w:tcPr>
+          <w:p>
+            <w:pPr>
+              <w:spacing w:after="0"/>
+            </w:pPr>
+            <w:r>
+              <w:rPr>
+                <w:sz w:val="19"/>
+              </w:rPr>
+              <w:t xml:space="preserve">3472</w:t>
+            </w:r>
+          </w:p>
+        </w:tc>
+        <w:tc>
+          <w:tcPr>
+            <w:tcW w:w="800" w:type="dxa"/>
+          </w:tcPr>
+          <w:p>
+            <w:pPr>
+              <w:spacing w:after="0"/>
+            </w:pPr>
+            <w:r>
+              <w:rPr>
+                <w:sz w:val="19"/>
+              </w:rPr>
+              <w:t xml:space="preserve">9.5</w:t>
+            </w:r>
+          </w:p>
+        </w:tc>
+        <w:tc>
+          <w:tcPr>
+            <w:tcW w:w="800" w:type="dxa"/>
+          </w:tcPr>
+          <w:p>
+            <w:pPr>
+              <w:spacing w:after="0"/>
+            </w:pPr>
+            <w:r>
+              <w:rPr>
+                <w:sz w:val="19"/>
+              </w:rPr>
+              <w:t xml:space="preserve">92.2</w:t>
+            </w:r>
+          </w:p>
+        </w:tc>
+        <w:tc>
+          <w:tcPr>
+            <w:tcW w:w="800" w:type="dxa"/>
+          </w:tcPr>
+          <w:p>
+            <w:pPr>
+              <w:spacing w:after="0"/>
+            </w:pPr>
+            <w:r>
+              <w:rPr>
+                <w:sz w:val="19"/>
+              </w:rPr>
+              <w:t xml:space="preserve">95.9</w:t>
+            </w:r>
+          </w:p>
+        </w:tc>
+        <w:tc>
+          <w:tcPr>
+            <w:tcW w:w="1500" w:type="dxa"/>
+          </w:tcPr>
+          <w:p>
+            <w:pPr>
+              <w:spacing w:after="0"/>
+            </w:pPr>
+          </w:p>
+        </w:tc>
+      </w:tr>
+      <w:tr>
+        <w:tc>
+          <w:tcPr>
+            <w:tcW w:w="2300" w:type="dxa"/>
+          </w:tcPr>
+          <w:p>
+            <w:pPr>
+              <w:spacing w:after="0"/>
+            </w:pPr>
+            <w:r>
+              <w:rPr>
+                <w:sz w:val="19"/>
+              </w:rPr>
+              <w:t xml:space="preserve">10 ms think, daemon</w:t>
+            </w:r>
+          </w:p>
+        </w:tc>
+        <w:tc>
+          <w:tcPr>
+            <w:tcW w:w="1150" w:type="dxa"/>
+          </w:tcPr>
+          <w:p>
+            <w:pPr>
+              <w:spacing w:after="0"/>
+            </w:pPr>
+            <w:r>
+              <w:rPr>
+                <w:sz w:val="19"/>
+              </w:rPr>
+              <w:t xml:space="preserve">58.5% ± 0.4</w:t>
+            </w:r>
+          </w:p>
+        </w:tc>
+        <w:tc>
+          <w:tcPr>
+            <w:tcW w:w="950" w:type="dxa"/>
+          </w:tcPr>
+          <w:p>
+            <w:pPr>
+              <w:spacing w:after="0"/>
+            </w:pPr>
+            <w:r>
+              <w:rPr>
+                <w:sz w:val="19"/>
+              </w:rPr>
+              <w:t xml:space="preserve">3468</w:t>
+            </w:r>
+          </w:p>
+        </w:tc>
+        <w:tc>
+          <w:tcPr>
+            <w:tcW w:w="800" w:type="dxa"/>
+          </w:tcPr>
+          <w:p>
+            <w:pPr>
+              <w:spacing w:after="0"/>
+            </w:pPr>
+            <w:r>
+              <w:rPr>
+                <w:sz w:val="19"/>
+              </w:rPr>
+              <w:t xml:space="preserve">5.9</w:t>
+            </w:r>
+          </w:p>
+        </w:tc>
+        <w:tc>
+          <w:tcPr>
+            <w:tcW w:w="800" w:type="dxa"/>
+          </w:tcPr>
+          <w:p>
+            <w:pPr>
+              <w:spacing w:after="0"/>
+            </w:pPr>
+            <w:r>
+              <w:rPr>
+                <w:sz w:val="19"/>
+              </w:rPr>
+              <w:t xml:space="preserve">95.9</w:t>
+            </w:r>
+          </w:p>
+        </w:tc>
+        <w:tc>
+          <w:tcPr>
+            <w:tcW w:w="800" w:type="dxa"/>
+          </w:tcPr>
+          <w:p>
+            <w:pPr>
+              <w:spacing w:after="0"/>
+            </w:pPr>
+            <w:r>
+              <w:rPr>
+                <w:sz w:val="19"/>
+              </w:rPr>
+              <w:t xml:space="preserve">221.4</w:t>
+            </w:r>
+          </w:p>
+        </w:tc>
+        <w:tc>
+          <w:tcPr>
+            <w:tcW w:w="1500" w:type="dxa"/>
+          </w:tcPr>
+          <w:p>
+            <w:pPr>
+              <w:spacing w:after="0"/>
+            </w:pPr>
+            <w:r>
+              <w:rPr>
+                <w:sz w:val="19"/>
+              </w:rPr>
+              <w:t xml:space="preserve">2297 (99.7%)</w:t>
+            </w:r>
+          </w:p>
+        </w:tc>
+      </w:tr>
+      <w:tr>
+        <w:tc>
+          <w:tcPr>
+            <w:tcW w:w="2300" w:type="dxa"/>
+          </w:tcPr>
+          <w:p>
+            <w:pPr>
+              <w:spacing w:after="0"/>
+            </w:pPr>
+            <w:r>
+              <w:rPr>
+                <w:sz w:val="19"/>
+              </w:rPr>
+              <w:t xml:space="preserve">10 ms think, adaptive limit</w:t>
+            </w:r>
+          </w:p>
+        </w:tc>
+        <w:tc>
+          <w:tcPr>
+            <w:tcW w:w="1150" w:type="dxa"/>
+          </w:tcPr>
+          <w:p>
+            <w:pPr>
+              <w:spacing w:after="0"/>
+            </w:pPr>
+            <w:r>
+              <w:rPr>
+                <w:sz w:val="19"/>
+              </w:rPr>
+              <w:t xml:space="preserve">35.0% ± 0.1</w:t>
+            </w:r>
+          </w:p>
+        </w:tc>
+        <w:tc>
+          <w:tcPr>
+            <w:tcW w:w="950" w:type="dxa"/>
+          </w:tcPr>
+          <w:p>
+            <w:pPr>
+              <w:spacing w:after="0"/>
+            </w:pPr>
+            <w:r>
+              <w:rPr>
+                <w:sz w:val="19"/>
+              </w:rPr>
+              <w:t xml:space="preserve">3493</w:t>
+            </w:r>
+          </w:p>
+        </w:tc>
+        <w:tc>
+          <w:tcPr>
+            <w:tcW w:w="800" w:type="dxa"/>
+          </w:tcPr>
+          <w:p>
+            <w:pPr>
+              <w:spacing w:after="0"/>
+            </w:pPr>
+            <w:r>
+              <w:rPr>
+                <w:sz w:val="19"/>
+              </w:rPr>
+              <w:t xml:space="preserve">9.3</w:t>
+            </w:r>
+          </w:p>
+        </w:tc>
+        <w:tc>
+          <w:tcPr>
+            <w:tcW w:w="800" w:type="dxa"/>
+          </w:tcPr>
+          <w:p>
+            <w:pPr>
+              <w:spacing w:after="0"/>
+            </w:pPr>
+            <w:r>
+              <w:rPr>
+                <w:sz w:val="19"/>
+              </w:rPr>
+              <w:t xml:space="preserve">92.0</w:t>
+            </w:r>
+          </w:p>
+        </w:tc>
+        <w:tc>
+          <w:tcPr>
+            <w:tcW w:w="800" w:type="dxa"/>
+          </w:tcPr>
+          <w:p>
+            <w:pPr>
+              <w:spacing w:after="0"/>
+            </w:pPr>
+            <w:r>
+              <w:rPr>
+                <w:sz w:val="19"/>
+              </w:rPr>
+              <w:t xml:space="preserve">96.1</w:t>
+            </w:r>
+          </w:p>
+        </w:tc>
+        <w:tc>
+          <w:tcPr>
+            <w:tcW w:w="1500" w:type="dxa"/>
+          </w:tcPr>
+          <w:p>
+            <w:pPr>
+              <w:spacing w:after="0"/>
+            </w:pPr>
+            <w:r>
+              <w:rPr>
+                <w:sz w:val="19"/>
+              </w:rPr>
+              <w:t xml:space="preserve">140 (36.4%)</w:t>
             </w:r>
           </w:p>
         </w:tc>
@@ -3616,7 +4082,16 @@
       </w:pPr>
       <w:r>
         <w:rPr/>
-        <w:t xml:space="preserve">Prefetching raised the hit rate from 1.1% to 43.8% and reads by 5.3%, and lowered the median latency, but the p99 latency rose from 98 ms to 286 ms. With about 99% of prefetches useful, wrong guesses cannot explain this. The prefetch reads themselves queue ahead of demand reads on the limited disk.</w:t>
+        <w:t xml:space="preserve">With 100 ms of think time the hit rate rose from 25.5% to 74.7%, but throughput changed by +1% (95% CI -3% to +5%, p = 0.688) and p99 latency by -2% (95% CI -33% to +29%, p = 0.852): neither is significant. Most of each step is think time, so faster reads hardly change the rate, and the disk is idle often enough to absorb the prefetches.</w:t>
+      </w:r>
+    </w:p>
+    <w:p>
+      <w:pPr>
+        <w:jc w:val="both"/>
+      </w:pPr>
+      <w:r>
+        <w:rPr/>
+        <w:t xml:space="preserve">With 10 ms of think time the median latency changed by -38% (95% CI -48% to -27%, p = 0.001), but the p99 latency rose from 96 ms to 221 ms, +131% (95% CI +72% to +190%, p = 0.006). With 99.7% of prefetches useful, wrong guesses cannot explain this: the prefetch reads themselves queue ahead of demand reads on the limited disk. The original run showed the same pattern (p99 from 98 ms to 286 ms). The adaptive limit rows are discussed in Section 6.9.</w:t>
       </w:r>
     </w:p>
     <w:p>
@@ -4508,6 +4983,3584 @@
     </w:p>
     <w:p>
       <w:pPr>
+        <w:pStyle w:val="Heading2"/>
+      </w:pPr>
+      <w:r>
+        <w:rPr/>
+        <w:t xml:space="preserve">6.7 Comparison with tuned kernel readahead</w:t>
+      </w:r>
+    </w:p>
+    <w:p>
+      <w:pPr>
+        <w:jc w:val="both"/>
+      </w:pPr>
+      <w:r>
+        <w:rPr/>
+        <w:t xml:space="preserve">To check that the daemon is compared against a fair baseline, the kernel's own readahead window was raised to 8 MB (</w:t>
+      </w:r>
+      <w:r>
+        <w:rPr>
+          <w:rFonts w:ascii="Courier New" w:hAnsi="Courier New"/>
+        </w:rPr>
+        <w:t xml:space="preserve">read_ahead_kb = 8192</w:t>
+      </w:r>
+      <w:r>
+        <w:rPr/>
+        <w:t xml:space="preserve">) and the precision gate (minimum precision 0.6, gate threshold 0.9) was added as a configuration.</w:t>
+      </w:r>
+    </w:p>
+    <w:p>
+      <w:pPr>
+        <w:jc w:val="both"/>
+      </w:pPr>
+      <w:r>
+        <w:rPr/>
+        <w:t xml:space="preserve">14 GB working set, predictable access:</w:t>
+      </w:r>
+    </w:p>
+    <w:tbl>
+      <w:tblPr>
+        <w:tblW w:w="0" w:type="auto"/>
+        <w:tblBorders>
+          <w:top w:val="single" w:sz="4" w:space="0" w:color="808080"/>
+          <w:left w:val="single" w:sz="4" w:space="0" w:color="808080"/>
+          <w:bottom w:val="single" w:sz="4" w:space="0" w:color="808080"/>
+          <w:right w:val="single" w:sz="4" w:space="0" w:color="808080"/>
+          <w:insideH w:val="single" w:sz="4" w:space="0" w:color="808080"/>
+          <w:insideV w:val="single" w:sz="4" w:space="0" w:color="808080"/>
+        </w:tblBorders>
+        <w:tblCellMar>
+          <w:left w:w="80" w:type="dxa"/>
+          <w:right w:w="80" w:type="dxa"/>
+        </w:tblCellMar>
+      </w:tblPr>
+      <w:tblGrid>
+        <w:gridCol w:w="3000"/>
+        <w:gridCol w:w="1300"/>
+        <w:gridCol w:w="1000"/>
+        <w:gridCol w:w="800"/>
+        <w:gridCol w:w="800"/>
+        <w:gridCol w:w="800"/>
+        <w:gridCol w:w="500"/>
+      </w:tblGrid>
+      <w:tr>
+        <w:tc>
+          <w:tcPr>
+            <w:tcW w:w="3000" w:type="dxa"/>
+            <w:shd w:val="clear" w:color="auto" w:fill="D9E2F3"/>
+          </w:tcPr>
+          <w:p>
+            <w:pPr>
+              <w:spacing w:after="0"/>
+            </w:pPr>
+            <w:r>
+              <w:rPr>
+                <w:b/>
+                <w:sz w:val="19"/>
+              </w:rPr>
+              <w:t xml:space="preserve">Configuration</w:t>
+            </w:r>
+          </w:p>
+        </w:tc>
+        <w:tc>
+          <w:tcPr>
+            <w:tcW w:w="1300" w:type="dxa"/>
+            <w:shd w:val="clear" w:color="auto" w:fill="D9E2F3"/>
+          </w:tcPr>
+          <w:p>
+            <w:pPr>
+              <w:spacing w:after="0"/>
+            </w:pPr>
+            <w:r>
+              <w:rPr>
+                <w:b/>
+                <w:sz w:val="19"/>
+              </w:rPr>
+              <w:t xml:space="preserve">Hit rate</w:t>
+            </w:r>
+          </w:p>
+        </w:tc>
+        <w:tc>
+          <w:tcPr>
+            <w:tcW w:w="1000" w:type="dxa"/>
+            <w:shd w:val="clear" w:color="auto" w:fill="D9E2F3"/>
+          </w:tcPr>
+          <w:p>
+            <w:pPr>
+              <w:spacing w:after="0"/>
+            </w:pPr>
+            <w:r>
+              <w:rPr>
+                <w:b/>
+                <w:sz w:val="19"/>
+              </w:rPr>
+              <w:t xml:space="preserve">Reads / run</w:t>
+            </w:r>
+          </w:p>
+        </w:tc>
+        <w:tc>
+          <w:tcPr>
+            <w:tcW w:w="800" w:type="dxa"/>
+            <w:shd w:val="clear" w:color="auto" w:fill="D9E2F3"/>
+          </w:tcPr>
+          <w:p>
+            <w:pPr>
+              <w:spacing w:after="0"/>
+            </w:pPr>
+            <w:r>
+              <w:rPr>
+                <w:b/>
+                <w:sz w:val="19"/>
+              </w:rPr>
+              <w:t xml:space="preserve">p50 (ms)</w:t>
+            </w:r>
+          </w:p>
+        </w:tc>
+        <w:tc>
+          <w:tcPr>
+            <w:tcW w:w="800" w:type="dxa"/>
+            <w:shd w:val="clear" w:color="auto" w:fill="D9E2F3"/>
+          </w:tcPr>
+          <w:p>
+            <w:pPr>
+              <w:spacing w:after="0"/>
+            </w:pPr>
+            <w:r>
+              <w:rPr>
+                <w:b/>
+                <w:sz w:val="19"/>
+              </w:rPr>
+              <w:t xml:space="preserve">p95 (ms)</w:t>
+            </w:r>
+          </w:p>
+        </w:tc>
+        <w:tc>
+          <w:tcPr>
+            <w:tcW w:w="800" w:type="dxa"/>
+            <w:shd w:val="clear" w:color="auto" w:fill="D9E2F3"/>
+          </w:tcPr>
+          <w:p>
+            <w:pPr>
+              <w:spacing w:after="0"/>
+            </w:pPr>
+            <w:r>
+              <w:rPr>
+                <w:b/>
+                <w:sz w:val="19"/>
+              </w:rPr>
+              <w:t xml:space="preserve">p99 (ms)</w:t>
+            </w:r>
+          </w:p>
+        </w:tc>
+        <w:tc>
+          <w:tcPr>
+            <w:tcW w:w="500" w:type="dxa"/>
+            <w:shd w:val="clear" w:color="auto" w:fill="D9E2F3"/>
+          </w:tcPr>
+          <w:p>
+            <w:pPr>
+              <w:spacing w:after="0"/>
+            </w:pPr>
+            <w:r>
+              <w:rPr>
+                <w:b/>
+                <w:sz w:val="19"/>
+              </w:rPr>
+              <w:t xml:space="preserve">n</w:t>
+            </w:r>
+          </w:p>
+        </w:tc>
+      </w:tr>
+      <w:tr>
+        <w:tc>
+          <w:tcPr>
+            <w:tcW w:w="3000" w:type="dxa"/>
+          </w:tcPr>
+          <w:p>
+            <w:pPr>
+              <w:spacing w:after="0"/>
+            </w:pPr>
+            <w:r>
+              <w:rPr>
+                <w:sz w:val="19"/>
+              </w:rPr>
+              <w:t xml:space="preserve">No Daemon (Default Linux Readahead)</w:t>
+            </w:r>
+          </w:p>
+        </w:tc>
+        <w:tc>
+          <w:tcPr>
+            <w:tcW w:w="1300" w:type="dxa"/>
+          </w:tcPr>
+          <w:p>
+            <w:pPr>
+              <w:spacing w:after="0"/>
+            </w:pPr>
+            <w:r>
+              <w:rPr>
+                <w:sz w:val="19"/>
+              </w:rPr>
+              <w:t xml:space="preserve">13.3% ± 0.7</w:t>
+            </w:r>
+          </w:p>
+        </w:tc>
+        <w:tc>
+          <w:tcPr>
+            <w:tcW w:w="1000" w:type="dxa"/>
+          </w:tcPr>
+          <w:p>
+            <w:pPr>
+              <w:spacing w:after="0"/>
+            </w:pPr>
+            <w:r>
+              <w:rPr>
+                <w:sz w:val="19"/>
+              </w:rPr>
+              <w:t xml:space="preserve">5534</w:t>
+            </w:r>
+          </w:p>
+        </w:tc>
+        <w:tc>
+          <w:tcPr>
+            <w:tcW w:w="800" w:type="dxa"/>
+          </w:tcPr>
+          <w:p>
+            <w:pPr>
+              <w:spacing w:after="0"/>
+            </w:pPr>
+            <w:r>
+              <w:rPr>
+                <w:sz w:val="19"/>
+              </w:rPr>
+              <w:t xml:space="preserve">9.3</w:t>
+            </w:r>
+          </w:p>
+        </w:tc>
+        <w:tc>
+          <w:tcPr>
+            <w:tcW w:w="800" w:type="dxa"/>
+          </w:tcPr>
+          <w:p>
+            <w:pPr>
+              <w:spacing w:after="0"/>
+            </w:pPr>
+            <w:r>
+              <w:rPr>
+                <w:sz w:val="19"/>
+              </w:rPr>
+              <w:t xml:space="preserve">19.1</w:t>
+            </w:r>
+          </w:p>
+        </w:tc>
+        <w:tc>
+          <w:tcPr>
+            <w:tcW w:w="800" w:type="dxa"/>
+          </w:tcPr>
+          <w:p>
+            <w:pPr>
+              <w:spacing w:after="0"/>
+            </w:pPr>
+            <w:r>
+              <w:rPr>
+                <w:sz w:val="19"/>
+              </w:rPr>
+              <w:t xml:space="preserve">27.5</w:t>
+            </w:r>
+          </w:p>
+        </w:tc>
+        <w:tc>
+          <w:tcPr>
+            <w:tcW w:w="500" w:type="dxa"/>
+          </w:tcPr>
+          <w:p>
+            <w:pPr>
+              <w:spacing w:after="0"/>
+            </w:pPr>
+            <w:r>
+              <w:rPr>
+                <w:sz w:val="19"/>
+              </w:rPr>
+              <w:t xml:space="preserve">5</w:t>
+            </w:r>
+          </w:p>
+        </w:tc>
+      </w:tr>
+      <w:tr>
+        <w:tc>
+          <w:tcPr>
+            <w:tcW w:w="3000" w:type="dxa"/>
+          </w:tcPr>
+          <w:p>
+            <w:pPr>
+              <w:spacing w:after="0"/>
+            </w:pPr>
+            <w:r>
+              <w:rPr>
+                <w:sz w:val="19"/>
+              </w:rPr>
+              <w:t xml:space="preserve">Full Context-Aware AI</w:t>
+            </w:r>
+          </w:p>
+        </w:tc>
+        <w:tc>
+          <w:tcPr>
+            <w:tcW w:w="1300" w:type="dxa"/>
+          </w:tcPr>
+          <w:p>
+            <w:pPr>
+              <w:spacing w:after="0"/>
+            </w:pPr>
+            <w:r>
+              <w:rPr>
+                <w:sz w:val="19"/>
+              </w:rPr>
+              <w:t xml:space="preserve">70.0% ± 0.8</w:t>
+            </w:r>
+          </w:p>
+        </w:tc>
+        <w:tc>
+          <w:tcPr>
+            <w:tcW w:w="1000" w:type="dxa"/>
+          </w:tcPr>
+          <w:p>
+            <w:pPr>
+              <w:spacing w:after="0"/>
+            </w:pPr>
+            <w:r>
+              <w:rPr>
+                <w:sz w:val="19"/>
+              </w:rPr>
+              <w:t xml:space="preserve">7145</w:t>
+            </w:r>
+          </w:p>
+        </w:tc>
+        <w:tc>
+          <w:tcPr>
+            <w:tcW w:w="800" w:type="dxa"/>
+          </w:tcPr>
+          <w:p>
+            <w:pPr>
+              <w:spacing w:after="0"/>
+            </w:pPr>
+            <w:r>
+              <w:rPr>
+                <w:sz w:val="19"/>
+              </w:rPr>
+              <w:t xml:space="preserve">4.1</w:t>
+            </w:r>
+          </w:p>
+        </w:tc>
+        <w:tc>
+          <w:tcPr>
+            <w:tcW w:w="800" w:type="dxa"/>
+          </w:tcPr>
+          <w:p>
+            <w:pPr>
+              <w:spacing w:after="0"/>
+            </w:pPr>
+            <w:r>
+              <w:rPr>
+                <w:sz w:val="19"/>
+              </w:rPr>
+              <w:t xml:space="preserve">14.8</w:t>
+            </w:r>
+          </w:p>
+        </w:tc>
+        <w:tc>
+          <w:tcPr>
+            <w:tcW w:w="800" w:type="dxa"/>
+          </w:tcPr>
+          <w:p>
+            <w:pPr>
+              <w:spacing w:after="0"/>
+            </w:pPr>
+            <w:r>
+              <w:rPr>
+                <w:sz w:val="19"/>
+              </w:rPr>
+              <w:t xml:space="preserve">25.2</w:t>
+            </w:r>
+          </w:p>
+        </w:tc>
+        <w:tc>
+          <w:tcPr>
+            <w:tcW w:w="500" w:type="dxa"/>
+          </w:tcPr>
+          <w:p>
+            <w:pPr>
+              <w:spacing w:after="0"/>
+            </w:pPr>
+            <w:r>
+              <w:rPr>
+                <w:sz w:val="19"/>
+              </w:rPr>
+              <w:t xml:space="preserve">5</w:t>
+            </w:r>
+          </w:p>
+        </w:tc>
+      </w:tr>
+      <w:tr>
+        <w:tc>
+          <w:tcPr>
+            <w:tcW w:w="3000" w:type="dxa"/>
+          </w:tcPr>
+          <w:p>
+            <w:pPr>
+              <w:spacing w:after="0"/>
+            </w:pPr>
+            <w:r>
+              <w:rPr>
+                <w:sz w:val="19"/>
+              </w:rPr>
+              <w:t xml:space="preserve">No daemon, kernel readahead tuned (read_ahead_kb=8192)</w:t>
+            </w:r>
+          </w:p>
+        </w:tc>
+        <w:tc>
+          <w:tcPr>
+            <w:tcW w:w="1300" w:type="dxa"/>
+          </w:tcPr>
+          <w:p>
+            <w:pPr>
+              <w:spacing w:after="0"/>
+            </w:pPr>
+            <w:r>
+              <w:rPr>
+                <w:sz w:val="19"/>
+              </w:rPr>
+              <w:t xml:space="preserve">13.5% ± 0.7</w:t>
+            </w:r>
+          </w:p>
+        </w:tc>
+        <w:tc>
+          <w:tcPr>
+            <w:tcW w:w="1000" w:type="dxa"/>
+          </w:tcPr>
+          <w:p>
+            <w:pPr>
+              <w:spacing w:after="0"/>
+            </w:pPr>
+            <w:r>
+              <w:rPr>
+                <w:sz w:val="19"/>
+              </w:rPr>
+              <w:t xml:space="preserve">5529</w:t>
+            </w:r>
+          </w:p>
+        </w:tc>
+        <w:tc>
+          <w:tcPr>
+            <w:tcW w:w="800" w:type="dxa"/>
+          </w:tcPr>
+          <w:p>
+            <w:pPr>
+              <w:spacing w:after="0"/>
+            </w:pPr>
+            <w:r>
+              <w:rPr>
+                <w:sz w:val="19"/>
+              </w:rPr>
+              <w:t xml:space="preserve">9.1</w:t>
+            </w:r>
+          </w:p>
+        </w:tc>
+        <w:tc>
+          <w:tcPr>
+            <w:tcW w:w="800" w:type="dxa"/>
+          </w:tcPr>
+          <w:p>
+            <w:pPr>
+              <w:spacing w:after="0"/>
+            </w:pPr>
+            <w:r>
+              <w:rPr>
+                <w:sz w:val="19"/>
+              </w:rPr>
+              <w:t xml:space="preserve">22.2</w:t>
+            </w:r>
+          </w:p>
+        </w:tc>
+        <w:tc>
+          <w:tcPr>
+            <w:tcW w:w="800" w:type="dxa"/>
+          </w:tcPr>
+          <w:p>
+            <w:pPr>
+              <w:spacing w:after="0"/>
+            </w:pPr>
+            <w:r>
+              <w:rPr>
+                <w:sz w:val="19"/>
+              </w:rPr>
+              <w:t xml:space="preserve">35.2</w:t>
+            </w:r>
+          </w:p>
+        </w:tc>
+        <w:tc>
+          <w:tcPr>
+            <w:tcW w:w="500" w:type="dxa"/>
+          </w:tcPr>
+          <w:p>
+            <w:pPr>
+              <w:spacing w:after="0"/>
+            </w:pPr>
+            <w:r>
+              <w:rPr>
+                <w:sz w:val="19"/>
+              </w:rPr>
+              <w:t xml:space="preserve">5</w:t>
+            </w:r>
+          </w:p>
+        </w:tc>
+      </w:tr>
+      <w:tr>
+        <w:tc>
+          <w:tcPr>
+            <w:tcW w:w="3000" w:type="dxa"/>
+          </w:tcPr>
+          <w:p>
+            <w:pPr>
+              <w:spacing w:after="0"/>
+            </w:pPr>
+            <w:r>
+              <w:rPr>
+                <w:sz w:val="19"/>
+              </w:rPr>
+              <w:t xml:space="preserve">Full AI + precision-aware gate (min precision 0.6)</w:t>
+            </w:r>
+          </w:p>
+        </w:tc>
+        <w:tc>
+          <w:tcPr>
+            <w:tcW w:w="1300" w:type="dxa"/>
+          </w:tcPr>
+          <w:p>
+            <w:pPr>
+              <w:spacing w:after="0"/>
+            </w:pPr>
+            <w:r>
+              <w:rPr>
+                <w:sz w:val="19"/>
+              </w:rPr>
+              <w:t xml:space="preserve">69.7% ± 0.7</w:t>
+            </w:r>
+          </w:p>
+        </w:tc>
+        <w:tc>
+          <w:tcPr>
+            <w:tcW w:w="1000" w:type="dxa"/>
+          </w:tcPr>
+          <w:p>
+            <w:pPr>
+              <w:spacing w:after="0"/>
+            </w:pPr>
+            <w:r>
+              <w:rPr>
+                <w:sz w:val="19"/>
+              </w:rPr>
+              <w:t xml:space="preserve">7204</w:t>
+            </w:r>
+          </w:p>
+        </w:tc>
+        <w:tc>
+          <w:tcPr>
+            <w:tcW w:w="800" w:type="dxa"/>
+          </w:tcPr>
+          <w:p>
+            <w:pPr>
+              <w:spacing w:after="0"/>
+            </w:pPr>
+            <w:r>
+              <w:rPr>
+                <w:sz w:val="19"/>
+              </w:rPr>
+              <w:t xml:space="preserve">3.9</w:t>
+            </w:r>
+          </w:p>
+        </w:tc>
+        <w:tc>
+          <w:tcPr>
+            <w:tcW w:w="800" w:type="dxa"/>
+          </w:tcPr>
+          <w:p>
+            <w:pPr>
+              <w:spacing w:after="0"/>
+            </w:pPr>
+            <w:r>
+              <w:rPr>
+                <w:sz w:val="19"/>
+              </w:rPr>
+              <w:t xml:space="preserve">14.7</w:t>
+            </w:r>
+          </w:p>
+        </w:tc>
+        <w:tc>
+          <w:tcPr>
+            <w:tcW w:w="800" w:type="dxa"/>
+          </w:tcPr>
+          <w:p>
+            <w:pPr>
+              <w:spacing w:after="0"/>
+            </w:pPr>
+            <w:r>
+              <w:rPr>
+                <w:sz w:val="19"/>
+              </w:rPr>
+              <w:t xml:space="preserve">25.1</w:t>
+            </w:r>
+          </w:p>
+        </w:tc>
+        <w:tc>
+          <w:tcPr>
+            <w:tcW w:w="500" w:type="dxa"/>
+          </w:tcPr>
+          <w:p>
+            <w:pPr>
+              <w:spacing w:after="0"/>
+            </w:pPr>
+            <w:r>
+              <w:rPr>
+                <w:sz w:val="19"/>
+              </w:rPr>
+              <w:t xml:space="preserve">5</w:t>
+            </w:r>
+          </w:p>
+        </w:tc>
+      </w:tr>
+    </w:tbl>
+    <w:p/>
+    <w:p>
+      <w:pPr>
+        <w:jc w:val="both"/>
+      </w:pPr>
+      <w:r>
+        <w:rPr/>
+        <w:t xml:space="preserve">Same, with 30% random accesses:</w:t>
+      </w:r>
+    </w:p>
+    <w:tbl>
+      <w:tblPr>
+        <w:tblW w:w="0" w:type="auto"/>
+        <w:tblBorders>
+          <w:top w:val="single" w:sz="4" w:space="0" w:color="808080"/>
+          <w:left w:val="single" w:sz="4" w:space="0" w:color="808080"/>
+          <w:bottom w:val="single" w:sz="4" w:space="0" w:color="808080"/>
+          <w:right w:val="single" w:sz="4" w:space="0" w:color="808080"/>
+          <w:insideH w:val="single" w:sz="4" w:space="0" w:color="808080"/>
+          <w:insideV w:val="single" w:sz="4" w:space="0" w:color="808080"/>
+        </w:tblBorders>
+        <w:tblCellMar>
+          <w:left w:w="80" w:type="dxa"/>
+          <w:right w:w="80" w:type="dxa"/>
+        </w:tblCellMar>
+      </w:tblPr>
+      <w:tblGrid>
+        <w:gridCol w:w="3000"/>
+        <w:gridCol w:w="1300"/>
+        <w:gridCol w:w="1000"/>
+        <w:gridCol w:w="800"/>
+        <w:gridCol w:w="800"/>
+        <w:gridCol w:w="800"/>
+        <w:gridCol w:w="500"/>
+      </w:tblGrid>
+      <w:tr>
+        <w:tc>
+          <w:tcPr>
+            <w:tcW w:w="3000" w:type="dxa"/>
+            <w:shd w:val="clear" w:color="auto" w:fill="D9E2F3"/>
+          </w:tcPr>
+          <w:p>
+            <w:pPr>
+              <w:spacing w:after="0"/>
+            </w:pPr>
+            <w:r>
+              <w:rPr>
+                <w:b/>
+                <w:sz w:val="19"/>
+              </w:rPr>
+              <w:t xml:space="preserve">Configuration</w:t>
+            </w:r>
+          </w:p>
+        </w:tc>
+        <w:tc>
+          <w:tcPr>
+            <w:tcW w:w="1300" w:type="dxa"/>
+            <w:shd w:val="clear" w:color="auto" w:fill="D9E2F3"/>
+          </w:tcPr>
+          <w:p>
+            <w:pPr>
+              <w:spacing w:after="0"/>
+            </w:pPr>
+            <w:r>
+              <w:rPr>
+                <w:b/>
+                <w:sz w:val="19"/>
+              </w:rPr>
+              <w:t xml:space="preserve">Hit rate</w:t>
+            </w:r>
+          </w:p>
+        </w:tc>
+        <w:tc>
+          <w:tcPr>
+            <w:tcW w:w="1000" w:type="dxa"/>
+            <w:shd w:val="clear" w:color="auto" w:fill="D9E2F3"/>
+          </w:tcPr>
+          <w:p>
+            <w:pPr>
+              <w:spacing w:after="0"/>
+            </w:pPr>
+            <w:r>
+              <w:rPr>
+                <w:b/>
+                <w:sz w:val="19"/>
+              </w:rPr>
+              <w:t xml:space="preserve">Reads / run</w:t>
+            </w:r>
+          </w:p>
+        </w:tc>
+        <w:tc>
+          <w:tcPr>
+            <w:tcW w:w="800" w:type="dxa"/>
+            <w:shd w:val="clear" w:color="auto" w:fill="D9E2F3"/>
+          </w:tcPr>
+          <w:p>
+            <w:pPr>
+              <w:spacing w:after="0"/>
+            </w:pPr>
+            <w:r>
+              <w:rPr>
+                <w:b/>
+                <w:sz w:val="19"/>
+              </w:rPr>
+              <w:t xml:space="preserve">p50 (ms)</w:t>
+            </w:r>
+          </w:p>
+        </w:tc>
+        <w:tc>
+          <w:tcPr>
+            <w:tcW w:w="800" w:type="dxa"/>
+            <w:shd w:val="clear" w:color="auto" w:fill="D9E2F3"/>
+          </w:tcPr>
+          <w:p>
+            <w:pPr>
+              <w:spacing w:after="0"/>
+            </w:pPr>
+            <w:r>
+              <w:rPr>
+                <w:b/>
+                <w:sz w:val="19"/>
+              </w:rPr>
+              <w:t xml:space="preserve">p95 (ms)</w:t>
+            </w:r>
+          </w:p>
+        </w:tc>
+        <w:tc>
+          <w:tcPr>
+            <w:tcW w:w="800" w:type="dxa"/>
+            <w:shd w:val="clear" w:color="auto" w:fill="D9E2F3"/>
+          </w:tcPr>
+          <w:p>
+            <w:pPr>
+              <w:spacing w:after="0"/>
+            </w:pPr>
+            <w:r>
+              <w:rPr>
+                <w:b/>
+                <w:sz w:val="19"/>
+              </w:rPr>
+              <w:t xml:space="preserve">p99 (ms)</w:t>
+            </w:r>
+          </w:p>
+        </w:tc>
+        <w:tc>
+          <w:tcPr>
+            <w:tcW w:w="500" w:type="dxa"/>
+            <w:shd w:val="clear" w:color="auto" w:fill="D9E2F3"/>
+          </w:tcPr>
+          <w:p>
+            <w:pPr>
+              <w:spacing w:after="0"/>
+            </w:pPr>
+            <w:r>
+              <w:rPr>
+                <w:b/>
+                <w:sz w:val="19"/>
+              </w:rPr>
+              <w:t xml:space="preserve">n</w:t>
+            </w:r>
+          </w:p>
+        </w:tc>
+      </w:tr>
+      <w:tr>
+        <w:tc>
+          <w:tcPr>
+            <w:tcW w:w="3000" w:type="dxa"/>
+          </w:tcPr>
+          <w:p>
+            <w:pPr>
+              <w:spacing w:after="0"/>
+            </w:pPr>
+            <w:r>
+              <w:rPr>
+                <w:sz w:val="19"/>
+              </w:rPr>
+              <w:t xml:space="preserve">No Daemon (Default Linux Readahead)</w:t>
+            </w:r>
+          </w:p>
+        </w:tc>
+        <w:tc>
+          <w:tcPr>
+            <w:tcW w:w="1300" w:type="dxa"/>
+          </w:tcPr>
+          <w:p>
+            <w:pPr>
+              <w:spacing w:after="0"/>
+            </w:pPr>
+            <w:r>
+              <w:rPr>
+                <w:sz w:val="19"/>
+              </w:rPr>
+              <w:t xml:space="preserve">42.5% ± 2.4</w:t>
+            </w:r>
+          </w:p>
+        </w:tc>
+        <w:tc>
+          <w:tcPr>
+            <w:tcW w:w="1000" w:type="dxa"/>
+          </w:tcPr>
+          <w:p>
+            <w:pPr>
+              <w:spacing w:after="0"/>
+            </w:pPr>
+            <w:r>
+              <w:rPr>
+                <w:sz w:val="19"/>
+              </w:rPr>
+              <w:t xml:space="preserve">6520</w:t>
+            </w:r>
+          </w:p>
+        </w:tc>
+        <w:tc>
+          <w:tcPr>
+            <w:tcW w:w="800" w:type="dxa"/>
+          </w:tcPr>
+          <w:p>
+            <w:pPr>
+              <w:spacing w:after="0"/>
+            </w:pPr>
+            <w:r>
+              <w:rPr>
+                <w:sz w:val="19"/>
+              </w:rPr>
+              <w:t xml:space="preserve">6.0</w:t>
+            </w:r>
+          </w:p>
+        </w:tc>
+        <w:tc>
+          <w:tcPr>
+            <w:tcW w:w="800" w:type="dxa"/>
+          </w:tcPr>
+          <w:p>
+            <w:pPr>
+              <w:spacing w:after="0"/>
+            </w:pPr>
+            <w:r>
+              <w:rPr>
+                <w:sz w:val="19"/>
+              </w:rPr>
+              <w:t xml:space="preserve">15.1</w:t>
+            </w:r>
+          </w:p>
+        </w:tc>
+        <w:tc>
+          <w:tcPr>
+            <w:tcW w:w="800" w:type="dxa"/>
+          </w:tcPr>
+          <w:p>
+            <w:pPr>
+              <w:spacing w:after="0"/>
+            </w:pPr>
+            <w:r>
+              <w:rPr>
+                <w:sz w:val="19"/>
+              </w:rPr>
+              <w:t xml:space="preserve">24.5</w:t>
+            </w:r>
+          </w:p>
+        </w:tc>
+        <w:tc>
+          <w:tcPr>
+            <w:tcW w:w="500" w:type="dxa"/>
+          </w:tcPr>
+          <w:p>
+            <w:pPr>
+              <w:spacing w:after="0"/>
+            </w:pPr>
+            <w:r>
+              <w:rPr>
+                <w:sz w:val="19"/>
+              </w:rPr>
+              <w:t xml:space="preserve">5</w:t>
+            </w:r>
+          </w:p>
+        </w:tc>
+      </w:tr>
+      <w:tr>
+        <w:tc>
+          <w:tcPr>
+            <w:tcW w:w="3000" w:type="dxa"/>
+          </w:tcPr>
+          <w:p>
+            <w:pPr>
+              <w:spacing w:after="0"/>
+            </w:pPr>
+            <w:r>
+              <w:rPr>
+                <w:sz w:val="19"/>
+              </w:rPr>
+              <w:t xml:space="preserve">Full Context-Aware AI</w:t>
+            </w:r>
+          </w:p>
+        </w:tc>
+        <w:tc>
+          <w:tcPr>
+            <w:tcW w:w="1300" w:type="dxa"/>
+          </w:tcPr>
+          <w:p>
+            <w:pPr>
+              <w:spacing w:after="0"/>
+            </w:pPr>
+            <w:r>
+              <w:rPr>
+                <w:sz w:val="19"/>
+              </w:rPr>
+              <w:t xml:space="preserve">54.0% ± 0.4</w:t>
+            </w:r>
+          </w:p>
+        </w:tc>
+        <w:tc>
+          <w:tcPr>
+            <w:tcW w:w="1000" w:type="dxa"/>
+          </w:tcPr>
+          <w:p>
+            <w:pPr>
+              <w:spacing w:after="0"/>
+            </w:pPr>
+            <w:r>
+              <w:rPr>
+                <w:sz w:val="19"/>
+              </w:rPr>
+              <w:t xml:space="preserve">6633</w:t>
+            </w:r>
+          </w:p>
+        </w:tc>
+        <w:tc>
+          <w:tcPr>
+            <w:tcW w:w="800" w:type="dxa"/>
+          </w:tcPr>
+          <w:p>
+            <w:pPr>
+              <w:spacing w:after="0"/>
+            </w:pPr>
+            <w:r>
+              <w:rPr>
+                <w:sz w:val="19"/>
+              </w:rPr>
+              <w:t xml:space="preserve">5.4</w:t>
+            </w:r>
+          </w:p>
+        </w:tc>
+        <w:tc>
+          <w:tcPr>
+            <w:tcW w:w="800" w:type="dxa"/>
+          </w:tcPr>
+          <w:p>
+            <w:pPr>
+              <w:spacing w:after="0"/>
+            </w:pPr>
+            <w:r>
+              <w:rPr>
+                <w:sz w:val="19"/>
+              </w:rPr>
+              <w:t xml:space="preserve">16.5</w:t>
+            </w:r>
+          </w:p>
+        </w:tc>
+        <w:tc>
+          <w:tcPr>
+            <w:tcW w:w="800" w:type="dxa"/>
+          </w:tcPr>
+          <w:p>
+            <w:pPr>
+              <w:spacing w:after="0"/>
+            </w:pPr>
+            <w:r>
+              <w:rPr>
+                <w:sz w:val="19"/>
+              </w:rPr>
+              <w:t xml:space="preserve">28.1</w:t>
+            </w:r>
+          </w:p>
+        </w:tc>
+        <w:tc>
+          <w:tcPr>
+            <w:tcW w:w="500" w:type="dxa"/>
+          </w:tcPr>
+          <w:p>
+            <w:pPr>
+              <w:spacing w:after="0"/>
+            </w:pPr>
+            <w:r>
+              <w:rPr>
+                <w:sz w:val="19"/>
+              </w:rPr>
+              <w:t xml:space="preserve">5</w:t>
+            </w:r>
+          </w:p>
+        </w:tc>
+      </w:tr>
+      <w:tr>
+        <w:tc>
+          <w:tcPr>
+            <w:tcW w:w="3000" w:type="dxa"/>
+          </w:tcPr>
+          <w:p>
+            <w:pPr>
+              <w:spacing w:after="0"/>
+            </w:pPr>
+            <w:r>
+              <w:rPr>
+                <w:sz w:val="19"/>
+              </w:rPr>
+              <w:t xml:space="preserve">No daemon, kernel readahead tuned (read_ahead_kb=8192)</w:t>
+            </w:r>
+          </w:p>
+        </w:tc>
+        <w:tc>
+          <w:tcPr>
+            <w:tcW w:w="1300" w:type="dxa"/>
+          </w:tcPr>
+          <w:p>
+            <w:pPr>
+              <w:spacing w:after="0"/>
+            </w:pPr>
+            <w:r>
+              <w:rPr>
+                <w:sz w:val="19"/>
+              </w:rPr>
+              <w:t xml:space="preserve">44.0% ± 1.0</w:t>
+            </w:r>
+          </w:p>
+        </w:tc>
+        <w:tc>
+          <w:tcPr>
+            <w:tcW w:w="1000" w:type="dxa"/>
+          </w:tcPr>
+          <w:p>
+            <w:pPr>
+              <w:spacing w:after="0"/>
+            </w:pPr>
+            <w:r>
+              <w:rPr>
+                <w:sz w:val="19"/>
+              </w:rPr>
+              <w:t xml:space="preserve">6355</w:t>
+            </w:r>
+          </w:p>
+        </w:tc>
+        <w:tc>
+          <w:tcPr>
+            <w:tcW w:w="800" w:type="dxa"/>
+          </w:tcPr>
+          <w:p>
+            <w:pPr>
+              <w:spacing w:after="0"/>
+            </w:pPr>
+            <w:r>
+              <w:rPr>
+                <w:sz w:val="19"/>
+              </w:rPr>
+              <w:t xml:space="preserve">6.7</w:t>
+            </w:r>
+          </w:p>
+        </w:tc>
+        <w:tc>
+          <w:tcPr>
+            <w:tcW w:w="800" w:type="dxa"/>
+          </w:tcPr>
+          <w:p>
+            <w:pPr>
+              <w:spacing w:after="0"/>
+            </w:pPr>
+            <w:r>
+              <w:rPr>
+                <w:sz w:val="19"/>
+              </w:rPr>
+              <w:t xml:space="preserve">16.8</w:t>
+            </w:r>
+          </w:p>
+        </w:tc>
+        <w:tc>
+          <w:tcPr>
+            <w:tcW w:w="800" w:type="dxa"/>
+          </w:tcPr>
+          <w:p>
+            <w:pPr>
+              <w:spacing w:after="0"/>
+            </w:pPr>
+            <w:r>
+              <w:rPr>
+                <w:sz w:val="19"/>
+              </w:rPr>
+              <w:t xml:space="preserve">31.9</w:t>
+            </w:r>
+          </w:p>
+        </w:tc>
+        <w:tc>
+          <w:tcPr>
+            <w:tcW w:w="500" w:type="dxa"/>
+          </w:tcPr>
+          <w:p>
+            <w:pPr>
+              <w:spacing w:after="0"/>
+            </w:pPr>
+            <w:r>
+              <w:rPr>
+                <w:sz w:val="19"/>
+              </w:rPr>
+              <w:t xml:space="preserve">5</w:t>
+            </w:r>
+          </w:p>
+        </w:tc>
+      </w:tr>
+      <w:tr>
+        <w:tc>
+          <w:tcPr>
+            <w:tcW w:w="3000" w:type="dxa"/>
+          </w:tcPr>
+          <w:p>
+            <w:pPr>
+              <w:spacing w:after="0"/>
+            </w:pPr>
+            <w:r>
+              <w:rPr>
+                <w:sz w:val="19"/>
+              </w:rPr>
+              <w:t xml:space="preserve">Full AI + precision-aware gate (min precision 0.6)</w:t>
+            </w:r>
+          </w:p>
+        </w:tc>
+        <w:tc>
+          <w:tcPr>
+            <w:tcW w:w="1300" w:type="dxa"/>
+          </w:tcPr>
+          <w:p>
+            <w:pPr>
+              <w:spacing w:after="0"/>
+            </w:pPr>
+            <w:r>
+              <w:rPr>
+                <w:sz w:val="19"/>
+              </w:rPr>
+              <w:t xml:space="preserve">49.8% ± 0.7</w:t>
+            </w:r>
+          </w:p>
+        </w:tc>
+        <w:tc>
+          <w:tcPr>
+            <w:tcW w:w="1000" w:type="dxa"/>
+          </w:tcPr>
+          <w:p>
+            <w:pPr>
+              <w:spacing w:after="0"/>
+            </w:pPr>
+            <w:r>
+              <w:rPr>
+                <w:sz w:val="19"/>
+              </w:rPr>
+              <w:t xml:space="preserve">6534</w:t>
+            </w:r>
+          </w:p>
+        </w:tc>
+        <w:tc>
+          <w:tcPr>
+            <w:tcW w:w="800" w:type="dxa"/>
+          </w:tcPr>
+          <w:p>
+            <w:pPr>
+              <w:spacing w:after="0"/>
+            </w:pPr>
+            <w:r>
+              <w:rPr>
+                <w:sz w:val="19"/>
+              </w:rPr>
+              <w:t xml:space="preserve">5.7</w:t>
+            </w:r>
+          </w:p>
+        </w:tc>
+        <w:tc>
+          <w:tcPr>
+            <w:tcW w:w="800" w:type="dxa"/>
+          </w:tcPr>
+          <w:p>
+            <w:pPr>
+              <w:spacing w:after="0"/>
+            </w:pPr>
+            <w:r>
+              <w:rPr>
+                <w:sz w:val="19"/>
+              </w:rPr>
+              <w:t xml:space="preserve">16.7</w:t>
+            </w:r>
+          </w:p>
+        </w:tc>
+        <w:tc>
+          <w:tcPr>
+            <w:tcW w:w="800" w:type="dxa"/>
+          </w:tcPr>
+          <w:p>
+            <w:pPr>
+              <w:spacing w:after="0"/>
+            </w:pPr>
+            <w:r>
+              <w:rPr>
+                <w:sz w:val="19"/>
+              </w:rPr>
+              <w:t xml:space="preserve">27.7</w:t>
+            </w:r>
+          </w:p>
+        </w:tc>
+        <w:tc>
+          <w:tcPr>
+            <w:tcW w:w="500" w:type="dxa"/>
+          </w:tcPr>
+          <w:p>
+            <w:pPr>
+              <w:spacing w:after="0"/>
+            </w:pPr>
+            <w:r>
+              <w:rPr>
+                <w:sz w:val="19"/>
+              </w:rPr>
+              <w:t xml:space="preserve">5</w:t>
+            </w:r>
+          </w:p>
+        </w:tc>
+      </w:tr>
+    </w:tbl>
+    <w:p/>
+    <w:p>
+      <w:pPr>
+        <w:pStyle w:val="Heading2"/>
+      </w:pPr>
+      <w:r>
+        <w:rPr/>
+        <w:t xml:space="preserve">6.8 Real applications</w:t>
+      </w:r>
+    </w:p>
+    <w:p>
+      <w:pPr>
+        <w:jc w:val="both"/>
+      </w:pPr>
+      <w:r>
+        <w:rPr/>
+        <w:t xml:space="preserve">The three real programs ran together for 60 seconds per run, five runs per configuration, with no memory limit and inside a cgroup limited to 400 MB and 300 MB. The cgroup holds both the programs and the daemon, so the daemon's own memory counts against the limit. For this workload the daemon also traced shared libraries and Python bytecode (</w:t>
+      </w:r>
+      <w:r>
+        <w:rPr>
+          <w:rFonts w:ascii="Courier New" w:hAnsi="Courier New"/>
+        </w:rPr>
+        <w:t xml:space="preserve">--include-libs</w:t>
+      </w:r>
+      <w:r>
+        <w:rPr/>
+        <w:t xml:space="preserve">), since for a program start-up those opens are the workload. Mean time per operation:</w:t>
+      </w:r>
+    </w:p>
+    <w:tbl>
+      <w:tblPr>
+        <w:tblW w:w="0" w:type="auto"/>
+        <w:tblBorders>
+          <w:top w:val="single" w:sz="4" w:space="0" w:color="808080"/>
+          <w:left w:val="single" w:sz="4" w:space="0" w:color="808080"/>
+          <w:bottom w:val="single" w:sz="4" w:space="0" w:color="808080"/>
+          <w:right w:val="single" w:sz="4" w:space="0" w:color="808080"/>
+          <w:insideH w:val="single" w:sz="4" w:space="0" w:color="808080"/>
+          <w:insideV w:val="single" w:sz="4" w:space="0" w:color="808080"/>
+        </w:tblBorders>
+        <w:tblCellMar>
+          <w:left w:w="80" w:type="dxa"/>
+          <w:right w:w="80" w:type="dxa"/>
+        </w:tblCellMar>
+      </w:tblPr>
+      <w:tblGrid>
+        <w:gridCol w:w="3200"/>
+        <w:gridCol w:w="1500"/>
+        <w:gridCol w:w="2000"/>
+        <w:gridCol w:w="1500"/>
+      </w:tblGrid>
+      <w:tr>
+        <w:tc>
+          <w:tcPr>
+            <w:tcW w:w="3200" w:type="dxa"/>
+            <w:shd w:val="clear" w:color="auto" w:fill="D9E2F3"/>
+          </w:tcPr>
+          <w:p>
+            <w:pPr>
+              <w:spacing w:after="0"/>
+            </w:pPr>
+            <w:r>
+              <w:rPr>
+                <w:b/>
+                <w:sz w:val="19"/>
+              </w:rPr>
+              <w:t xml:space="preserve">Memory limit, configuration</w:t>
+            </w:r>
+          </w:p>
+        </w:tc>
+        <w:tc>
+          <w:tcPr>
+            <w:tcW w:w="1500" w:type="dxa"/>
+            <w:shd w:val="clear" w:color="auto" w:fill="D9E2F3"/>
+          </w:tcPr>
+          <w:p>
+            <w:pPr>
+              <w:spacing w:after="0"/>
+            </w:pPr>
+            <w:r>
+              <w:rPr>
+                <w:b/>
+                <w:sz w:val="19"/>
+              </w:rPr>
+              <w:t xml:space="preserve">Build (s)</w:t>
+            </w:r>
+          </w:p>
+        </w:tc>
+        <w:tc>
+          <w:tcPr>
+            <w:tcW w:w="2000" w:type="dxa"/>
+            <w:shd w:val="clear" w:color="auto" w:fill="D9E2F3"/>
+          </w:tcPr>
+          <w:p>
+            <w:pPr>
+              <w:spacing w:after="0"/>
+            </w:pPr>
+            <w:r>
+              <w:rPr>
+                <w:b/>
+                <w:sz w:val="19"/>
+              </w:rPr>
+              <w:t xml:space="preserve">Python start-up (ms)</w:t>
+            </w:r>
+          </w:p>
+        </w:tc>
+        <w:tc>
+          <w:tcPr>
+            <w:tcW w:w="1500" w:type="dxa"/>
+            <w:shd w:val="clear" w:color="auto" w:fill="D9E2F3"/>
+          </w:tcPr>
+          <w:p>
+            <w:pPr>
+              <w:spacing w:after="0"/>
+            </w:pPr>
+            <w:r>
+              <w:rPr>
+                <w:b/>
+                <w:sz w:val="19"/>
+              </w:rPr>
+              <w:t xml:space="preserve">Search (ms)</w:t>
+            </w:r>
+          </w:p>
+        </w:tc>
+      </w:tr>
+      <w:tr>
+        <w:tc>
+          <w:tcPr>
+            <w:tcW w:w="3200" w:type="dxa"/>
+          </w:tcPr>
+          <w:p>
+            <w:pPr>
+              <w:spacing w:after="0"/>
+            </w:pPr>
+            <w:r>
+              <w:rPr>
+                <w:sz w:val="19"/>
+              </w:rPr>
+              <w:t xml:space="preserve">No limit, no daemon</w:t>
+            </w:r>
+          </w:p>
+        </w:tc>
+        <w:tc>
+          <w:tcPr>
+            <w:tcW w:w="1500" w:type="dxa"/>
+          </w:tcPr>
+          <w:p>
+            <w:pPr>
+              <w:spacing w:after="0"/>
+            </w:pPr>
+            <w:r>
+              <w:rPr>
+                <w:sz w:val="19"/>
+              </w:rPr>
+              <w:t xml:space="preserve">11.26</w:t>
+            </w:r>
+          </w:p>
+        </w:tc>
+        <w:tc>
+          <w:tcPr>
+            <w:tcW w:w="2000" w:type="dxa"/>
+          </w:tcPr>
+          <w:p>
+            <w:pPr>
+              <w:spacing w:after="0"/>
+            </w:pPr>
+            <w:r>
+              <w:rPr>
+                <w:sz w:val="19"/>
+              </w:rPr>
+              <w:t xml:space="preserve">57.8</w:t>
+            </w:r>
+          </w:p>
+        </w:tc>
+        <w:tc>
+          <w:tcPr>
+            <w:tcW w:w="1500" w:type="dxa"/>
+          </w:tcPr>
+          <w:p>
+            <w:pPr>
+              <w:spacing w:after="0"/>
+            </w:pPr>
+            <w:r>
+              <w:rPr>
+                <w:sz w:val="19"/>
+              </w:rPr>
+              <w:t xml:space="preserve">62.8</w:t>
+            </w:r>
+          </w:p>
+        </w:tc>
+      </w:tr>
+      <w:tr>
+        <w:tc>
+          <w:tcPr>
+            <w:tcW w:w="3200" w:type="dxa"/>
+          </w:tcPr>
+          <w:p>
+            <w:pPr>
+              <w:spacing w:after="0"/>
+            </w:pPr>
+            <w:r>
+              <w:rPr>
+                <w:sz w:val="19"/>
+              </w:rPr>
+              <w:t xml:space="preserve">No limit, daemon</w:t>
+            </w:r>
+          </w:p>
+        </w:tc>
+        <w:tc>
+          <w:tcPr>
+            <w:tcW w:w="1500" w:type="dxa"/>
+          </w:tcPr>
+          <w:p>
+            <w:pPr>
+              <w:spacing w:after="0"/>
+            </w:pPr>
+            <w:r>
+              <w:rPr>
+                <w:sz w:val="19"/>
+              </w:rPr>
+              <w:t xml:space="preserve">12.36</w:t>
+            </w:r>
+          </w:p>
+        </w:tc>
+        <w:tc>
+          <w:tcPr>
+            <w:tcW w:w="2000" w:type="dxa"/>
+          </w:tcPr>
+          <w:p>
+            <w:pPr>
+              <w:spacing w:after="0"/>
+            </w:pPr>
+            <w:r>
+              <w:rPr>
+                <w:sz w:val="19"/>
+              </w:rPr>
+              <w:t xml:space="preserve">70.3</w:t>
+            </w:r>
+          </w:p>
+        </w:tc>
+        <w:tc>
+          <w:tcPr>
+            <w:tcW w:w="1500" w:type="dxa"/>
+          </w:tcPr>
+          <w:p>
+            <w:pPr>
+              <w:spacing w:after="0"/>
+            </w:pPr>
+            <w:r>
+              <w:rPr>
+                <w:sz w:val="19"/>
+              </w:rPr>
+              <w:t xml:space="preserve">69.8</w:t>
+            </w:r>
+          </w:p>
+        </w:tc>
+      </w:tr>
+      <w:tr>
+        <w:tc>
+          <w:tcPr>
+            <w:tcW w:w="3200" w:type="dxa"/>
+          </w:tcPr>
+          <w:p>
+            <w:pPr>
+              <w:spacing w:after="0"/>
+            </w:pPr>
+            <w:r>
+              <w:rPr>
+                <w:sz w:val="19"/>
+              </w:rPr>
+              <w:t xml:space="preserve">400 MB, no daemon</w:t>
+            </w:r>
+          </w:p>
+        </w:tc>
+        <w:tc>
+          <w:tcPr>
+            <w:tcW w:w="1500" w:type="dxa"/>
+          </w:tcPr>
+          <w:p>
+            <w:pPr>
+              <w:spacing w:after="0"/>
+            </w:pPr>
+            <w:r>
+              <w:rPr>
+                <w:sz w:val="19"/>
+              </w:rPr>
+              <w:t xml:space="preserve">11.30</w:t>
+            </w:r>
+          </w:p>
+        </w:tc>
+        <w:tc>
+          <w:tcPr>
+            <w:tcW w:w="2000" w:type="dxa"/>
+          </w:tcPr>
+          <w:p>
+            <w:pPr>
+              <w:spacing w:after="0"/>
+            </w:pPr>
+            <w:r>
+              <w:rPr>
+                <w:sz w:val="19"/>
+              </w:rPr>
+              <w:t xml:space="preserve">57.9</w:t>
+            </w:r>
+          </w:p>
+        </w:tc>
+        <w:tc>
+          <w:tcPr>
+            <w:tcW w:w="1500" w:type="dxa"/>
+          </w:tcPr>
+          <w:p>
+            <w:pPr>
+              <w:spacing w:after="0"/>
+            </w:pPr>
+            <w:r>
+              <w:rPr>
+                <w:sz w:val="19"/>
+              </w:rPr>
+              <w:t xml:space="preserve">63.7</w:t>
+            </w:r>
+          </w:p>
+        </w:tc>
+      </w:tr>
+      <w:tr>
+        <w:tc>
+          <w:tcPr>
+            <w:tcW w:w="3200" w:type="dxa"/>
+          </w:tcPr>
+          <w:p>
+            <w:pPr>
+              <w:spacing w:after="0"/>
+            </w:pPr>
+            <w:r>
+              <w:rPr>
+                <w:sz w:val="19"/>
+              </w:rPr>
+              <w:t xml:space="preserve">400 MB, daemon</w:t>
+            </w:r>
+          </w:p>
+        </w:tc>
+        <w:tc>
+          <w:tcPr>
+            <w:tcW w:w="1500" w:type="dxa"/>
+          </w:tcPr>
+          <w:p>
+            <w:pPr>
+              <w:spacing w:after="0"/>
+            </w:pPr>
+            <w:r>
+              <w:rPr>
+                <w:sz w:val="19"/>
+              </w:rPr>
+              <w:t xml:space="preserve">12.58</w:t>
+            </w:r>
+          </w:p>
+        </w:tc>
+        <w:tc>
+          <w:tcPr>
+            <w:tcW w:w="2000" w:type="dxa"/>
+          </w:tcPr>
+          <w:p>
+            <w:pPr>
+              <w:spacing w:after="0"/>
+            </w:pPr>
+            <w:r>
+              <w:rPr>
+                <w:sz w:val="19"/>
+              </w:rPr>
+              <w:t xml:space="preserve">69.7</w:t>
+            </w:r>
+          </w:p>
+        </w:tc>
+        <w:tc>
+          <w:tcPr>
+            <w:tcW w:w="1500" w:type="dxa"/>
+          </w:tcPr>
+          <w:p>
+            <w:pPr>
+              <w:spacing w:after="0"/>
+            </w:pPr>
+            <w:r>
+              <w:rPr>
+                <w:sz w:val="19"/>
+              </w:rPr>
+              <w:t xml:space="preserve">77.4</w:t>
+            </w:r>
+          </w:p>
+        </w:tc>
+      </w:tr>
+      <w:tr>
+        <w:tc>
+          <w:tcPr>
+            <w:tcW w:w="3200" w:type="dxa"/>
+          </w:tcPr>
+          <w:p>
+            <w:pPr>
+              <w:spacing w:after="0"/>
+            </w:pPr>
+            <w:r>
+              <w:rPr>
+                <w:sz w:val="19"/>
+              </w:rPr>
+              <w:t xml:space="preserve">300 MB, no daemon</w:t>
+            </w:r>
+          </w:p>
+        </w:tc>
+        <w:tc>
+          <w:tcPr>
+            <w:tcW w:w="1500" w:type="dxa"/>
+          </w:tcPr>
+          <w:p>
+            <w:pPr>
+              <w:spacing w:after="0"/>
+            </w:pPr>
+            <w:r>
+              <w:rPr>
+                <w:sz w:val="19"/>
+              </w:rPr>
+              <w:t xml:space="preserve">11.42</w:t>
+            </w:r>
+          </w:p>
+        </w:tc>
+        <w:tc>
+          <w:tcPr>
+            <w:tcW w:w="2000" w:type="dxa"/>
+          </w:tcPr>
+          <w:p>
+            <w:pPr>
+              <w:spacing w:after="0"/>
+            </w:pPr>
+            <w:r>
+              <w:rPr>
+                <w:sz w:val="19"/>
+              </w:rPr>
+              <w:t xml:space="preserve">58.6</w:t>
+            </w:r>
+          </w:p>
+        </w:tc>
+        <w:tc>
+          <w:tcPr>
+            <w:tcW w:w="1500" w:type="dxa"/>
+          </w:tcPr>
+          <w:p>
+            <w:pPr>
+              <w:spacing w:after="0"/>
+            </w:pPr>
+            <w:r>
+              <w:rPr>
+                <w:sz w:val="19"/>
+              </w:rPr>
+              <w:t xml:space="preserve">63.6</w:t>
+            </w:r>
+          </w:p>
+        </w:tc>
+      </w:tr>
+      <w:tr>
+        <w:tc>
+          <w:tcPr>
+            <w:tcW w:w="3200" w:type="dxa"/>
+          </w:tcPr>
+          <w:p>
+            <w:pPr>
+              <w:spacing w:after="0"/>
+            </w:pPr>
+            <w:r>
+              <w:rPr>
+                <w:sz w:val="19"/>
+              </w:rPr>
+              <w:t xml:space="preserve">300 MB, daemon</w:t>
+            </w:r>
+          </w:p>
+        </w:tc>
+        <w:tc>
+          <w:tcPr>
+            <w:tcW w:w="1500" w:type="dxa"/>
+          </w:tcPr>
+          <w:p>
+            <w:pPr>
+              <w:spacing w:after="0"/>
+            </w:pPr>
+            <w:r>
+              <w:rPr>
+                <w:sz w:val="19"/>
+              </w:rPr>
+              <w:t xml:space="preserve">14.07</w:t>
+            </w:r>
+          </w:p>
+        </w:tc>
+        <w:tc>
+          <w:tcPr>
+            <w:tcW w:w="2000" w:type="dxa"/>
+          </w:tcPr>
+          <w:p>
+            <w:pPr>
+              <w:spacing w:after="0"/>
+            </w:pPr>
+            <w:r>
+              <w:rPr>
+                <w:sz w:val="19"/>
+              </w:rPr>
+              <w:t xml:space="preserve">84.7</w:t>
+            </w:r>
+          </w:p>
+        </w:tc>
+        <w:tc>
+          <w:tcPr>
+            <w:tcW w:w="1500" w:type="dxa"/>
+          </w:tcPr>
+          <w:p>
+            <w:pPr>
+              <w:spacing w:after="0"/>
+            </w:pPr>
+            <w:r>
+              <w:rPr>
+                <w:sz w:val="19"/>
+              </w:rPr>
+              <w:t xml:space="preserve">133.1</w:t>
+            </w:r>
+          </w:p>
+        </w:tc>
+      </w:tr>
+    </w:tbl>
+    <w:p/>
+    <w:p>
+      <w:pPr>
+        <w:jc w:val="both"/>
+      </w:pPr>
+      <w:r>
+        <w:rPr/>
+        <w:t xml:space="preserve">Change in time per operation with the daemon, relative to no daemon:</w:t>
+      </w:r>
+    </w:p>
+    <w:tbl>
+      <w:tblPr>
+        <w:tblW w:w="0" w:type="auto"/>
+        <w:tblBorders>
+          <w:top w:val="single" w:sz="4" w:space="0" w:color="808080"/>
+          <w:left w:val="single" w:sz="4" w:space="0" w:color="808080"/>
+          <w:bottom w:val="single" w:sz="4" w:space="0" w:color="808080"/>
+          <w:right w:val="single" w:sz="4" w:space="0" w:color="808080"/>
+          <w:insideH w:val="single" w:sz="4" w:space="0" w:color="808080"/>
+          <w:insideV w:val="single" w:sz="4" w:space="0" w:color="808080"/>
+        </w:tblBorders>
+        <w:tblCellMar>
+          <w:left w:w="80" w:type="dxa"/>
+          <w:right w:w="80" w:type="dxa"/>
+        </w:tblCellMar>
+      </w:tblPr>
+      <w:tblGrid>
+        <w:gridCol w:w="2000"/>
+        <w:gridCol w:w="2000"/>
+        <w:gridCol w:w="2000"/>
+        <w:gridCol w:w="2000"/>
+      </w:tblGrid>
+      <w:tr>
+        <w:tc>
+          <w:tcPr>
+            <w:tcW w:w="2000" w:type="dxa"/>
+            <w:shd w:val="clear" w:color="auto" w:fill="D9E2F3"/>
+          </w:tcPr>
+          <w:p>
+            <w:pPr>
+              <w:spacing w:after="0"/>
+            </w:pPr>
+            <w:r>
+              <w:rPr>
+                <w:b/>
+                <w:sz w:val="19"/>
+              </w:rPr>
+              <w:t xml:space="preserve">Memory limit</w:t>
+            </w:r>
+          </w:p>
+        </w:tc>
+        <w:tc>
+          <w:tcPr>
+            <w:tcW w:w="2000" w:type="dxa"/>
+            <w:shd w:val="clear" w:color="auto" w:fill="D9E2F3"/>
+          </w:tcPr>
+          <w:p>
+            <w:pPr>
+              <w:spacing w:after="0"/>
+            </w:pPr>
+            <w:r>
+              <w:rPr>
+                <w:b/>
+                <w:sz w:val="19"/>
+              </w:rPr>
+              <w:t xml:space="preserve">Build</w:t>
+            </w:r>
+          </w:p>
+        </w:tc>
+        <w:tc>
+          <w:tcPr>
+            <w:tcW w:w="2000" w:type="dxa"/>
+            <w:shd w:val="clear" w:color="auto" w:fill="D9E2F3"/>
+          </w:tcPr>
+          <w:p>
+            <w:pPr>
+              <w:spacing w:after="0"/>
+            </w:pPr>
+            <w:r>
+              <w:rPr>
+                <w:b/>
+                <w:sz w:val="19"/>
+              </w:rPr>
+              <w:t xml:space="preserve">Python start-up</w:t>
+            </w:r>
+          </w:p>
+        </w:tc>
+        <w:tc>
+          <w:tcPr>
+            <w:tcW w:w="2000" w:type="dxa"/>
+            <w:shd w:val="clear" w:color="auto" w:fill="D9E2F3"/>
+          </w:tcPr>
+          <w:p>
+            <w:pPr>
+              <w:spacing w:after="0"/>
+            </w:pPr>
+            <w:r>
+              <w:rPr>
+                <w:b/>
+                <w:sz w:val="19"/>
+              </w:rPr>
+              <w:t xml:space="preserve">Search</w:t>
+            </w:r>
+          </w:p>
+        </w:tc>
+      </w:tr>
+      <w:tr>
+        <w:tc>
+          <w:tcPr>
+            <w:tcW w:w="2000" w:type="dxa"/>
+          </w:tcPr>
+          <w:p>
+            <w:pPr>
+              <w:spacing w:after="0"/>
+            </w:pPr>
+            <w:r>
+              <w:rPr>
+                <w:sz w:val="19"/>
+              </w:rPr>
+              <w:t xml:space="preserve">No limit</w:t>
+            </w:r>
+          </w:p>
+        </w:tc>
+        <w:tc>
+          <w:tcPr>
+            <w:tcW w:w="2000" w:type="dxa"/>
+          </w:tcPr>
+          <w:p>
+            <w:pPr>
+              <w:spacing w:after="0"/>
+            </w:pPr>
+            <w:r>
+              <w:rPr>
+                <w:sz w:val="19"/>
+              </w:rPr>
+              <w:t xml:space="preserve">+10% (p = 0.053)</w:t>
+            </w:r>
+          </w:p>
+        </w:tc>
+        <w:tc>
+          <w:tcPr>
+            <w:tcW w:w="2000" w:type="dxa"/>
+          </w:tcPr>
+          <w:p>
+            <w:pPr>
+              <w:spacing w:after="0"/>
+            </w:pPr>
+            <w:r>
+              <w:rPr>
+                <w:sz w:val="19"/>
+              </w:rPr>
+              <w:t xml:space="preserve">+22% (p = 0.014)</w:t>
+            </w:r>
+          </w:p>
+        </w:tc>
+        <w:tc>
+          <w:tcPr>
+            <w:tcW w:w="2000" w:type="dxa"/>
+          </w:tcPr>
+          <w:p>
+            <w:pPr>
+              <w:spacing w:after="0"/>
+            </w:pPr>
+            <w:r>
+              <w:rPr>
+                <w:sz w:val="19"/>
+              </w:rPr>
+              <w:t xml:space="preserve">+11% (p = 0.018)</w:t>
+            </w:r>
+          </w:p>
+        </w:tc>
+      </w:tr>
+      <w:tr>
+        <w:tc>
+          <w:tcPr>
+            <w:tcW w:w="2000" w:type="dxa"/>
+          </w:tcPr>
+          <w:p>
+            <w:pPr>
+              <w:spacing w:after="0"/>
+            </w:pPr>
+            <w:r>
+              <w:rPr>
+                <w:sz w:val="19"/>
+              </w:rPr>
+              <w:t xml:space="preserve">400 MB</w:t>
+            </w:r>
+          </w:p>
+        </w:tc>
+        <w:tc>
+          <w:tcPr>
+            <w:tcW w:w="2000" w:type="dxa"/>
+          </w:tcPr>
+          <w:p>
+            <w:pPr>
+              <w:spacing w:after="0"/>
+            </w:pPr>
+            <w:r>
+              <w:rPr>
+                <w:sz w:val="19"/>
+              </w:rPr>
+              <w:t xml:space="preserve">+11% (p &lt; 0.001)</w:t>
+            </w:r>
+          </w:p>
+        </w:tc>
+        <w:tc>
+          <w:tcPr>
+            <w:tcW w:w="2000" w:type="dxa"/>
+          </w:tcPr>
+          <w:p>
+            <w:pPr>
+              <w:spacing w:after="0"/>
+            </w:pPr>
+            <w:r>
+              <w:rPr>
+                <w:sz w:val="19"/>
+              </w:rPr>
+              <w:t xml:space="preserve">+20% (p &lt; 0.001)</w:t>
+            </w:r>
+          </w:p>
+        </w:tc>
+        <w:tc>
+          <w:tcPr>
+            <w:tcW w:w="2000" w:type="dxa"/>
+          </w:tcPr>
+          <w:p>
+            <w:pPr>
+              <w:spacing w:after="0"/>
+            </w:pPr>
+            <w:r>
+              <w:rPr>
+                <w:sz w:val="19"/>
+              </w:rPr>
+              <w:t xml:space="preserve">+21% (p &lt; 0.001)</w:t>
+            </w:r>
+          </w:p>
+        </w:tc>
+      </w:tr>
+      <w:tr>
+        <w:tc>
+          <w:tcPr>
+            <w:tcW w:w="2000" w:type="dxa"/>
+          </w:tcPr>
+          <w:p>
+            <w:pPr>
+              <w:spacing w:after="0"/>
+            </w:pPr>
+            <w:r>
+              <w:rPr>
+                <w:sz w:val="19"/>
+              </w:rPr>
+              <w:t xml:space="preserve">300 MB</w:t>
+            </w:r>
+          </w:p>
+        </w:tc>
+        <w:tc>
+          <w:tcPr>
+            <w:tcW w:w="2000" w:type="dxa"/>
+          </w:tcPr>
+          <w:p>
+            <w:pPr>
+              <w:spacing w:after="0"/>
+            </w:pPr>
+            <w:r>
+              <w:rPr>
+                <w:sz w:val="19"/>
+              </w:rPr>
+              <w:t xml:space="preserve">+23% (p &lt; 0.001)</w:t>
+            </w:r>
+          </w:p>
+        </w:tc>
+        <w:tc>
+          <w:tcPr>
+            <w:tcW w:w="2000" w:type="dxa"/>
+          </w:tcPr>
+          <w:p>
+            <w:pPr>
+              <w:spacing w:after="0"/>
+            </w:pPr>
+            <w:r>
+              <w:rPr>
+                <w:sz w:val="19"/>
+              </w:rPr>
+              <w:t xml:space="preserve">+45% (p &lt; 0.001)</w:t>
+            </w:r>
+          </w:p>
+        </w:tc>
+        <w:tc>
+          <w:tcPr>
+            <w:tcW w:w="2000" w:type="dxa"/>
+          </w:tcPr>
+          <w:p>
+            <w:pPr>
+              <w:spacing w:after="0"/>
+            </w:pPr>
+            <w:r>
+              <w:rPr>
+                <w:sz w:val="19"/>
+              </w:rPr>
+              <w:t xml:space="preserve">+109% (p &lt; 0.001)</w:t>
+            </w:r>
+          </w:p>
+        </w:tc>
+      </w:tr>
+    </w:tbl>
+    <w:p/>
+    <w:p>
+      <w:pPr>
+        <w:jc w:val="both"/>
+      </w:pPr>
+      <w:r>
+        <w:rPr/>
+        <w:t xml:space="preserve">The daemon made every program slower, and the slowdown grew as the limit shrank. Prediction was accurate (93% of prefetches were read), but there was nothing to gain: without the daemon the build time barely changed between no limit and 300 MB (11.26 s and 11.42 s), so the programs' files stayed cached. What was left was cost. In one 60-second run at 300 MB the daemon handled 1.0 million open events at 45 microseconds each, used 55 seconds of CPU time (almost one of the four cores) and held 197 MB of memory inside the same limit. In the synthetic tests each open is followed by 10 MB of disk reads, so a few tens of microseconds per open do not matter; here each open is followed by a few kilobytes that are already in memory, and the same cost dominates.</w:t>
+      </w:r>
+    </w:p>
+    <w:p>
+      <w:pPr>
+        <w:pStyle w:val="Heading2"/>
+      </w:pPr>
+      <w:r>
+        <w:rPr/>
+        <w:t xml:space="preserve">6.9 Prediction-driven eviction and an adaptive I/O limit</w:t>
+      </w:r>
+    </w:p>
+    <w:p>
+      <w:pPr>
+        <w:jc w:val="both"/>
+      </w:pPr>
+      <w:r>
+        <w:rPr/>
+        <w:t xml:space="preserve">Two optional policies were added to address the costs found above.</w:t>
+      </w:r>
+    </w:p>
+    <w:p>
+      <w:pPr>
+        <w:ind w:left="540" w:hanging="270"/>
+        <w:spacing w:after="60"/>
+      </w:pPr>
+      <w:r>
+        <w:rPr/>
+        <w:t xml:space="preserve">•  </w:t>
+      </w:r>
+      <w:r>
+        <w:rPr>
+          <w:b/>
+        </w:rPr>
+        <w:t xml:space="preserve">Dead-file eviction (`--evict-dead`).</w:t>
+      </w:r>
+      <w:r>
+        <w:rPr/>
+        <w:t xml:space="preserve"> Under LRU, a file whose reuse distance is larger than the cache is evicted before it is used again, so keeping it after use only pushes out other data. The daemon estimates each file's reuse distance as the number of opens between successive opens of that file (an exponentially weighted average) times the mean file size. When a file is closed, was not itself just prefetched, and its reuse distance exceeds the page cache available to the process, the daemon drops it with </w:t>
+      </w:r>
+      <w:r>
+        <w:rPr>
+          <w:rFonts w:ascii="Courier New" w:hAnsi="Courier New"/>
+        </w:rPr>
+        <w:t xml:space="preserve">POSIX_FADV_DONTNEED</w:t>
+      </w:r>
+      <w:r>
+        <w:rPr/>
+        <w:t xml:space="preserve">. This is the eviction half of the original design.</w:t>
+      </w:r>
+    </w:p>
+    <w:p>
+      <w:pPr>
+        <w:ind w:left="540" w:hanging="270"/>
+        <w:spacing w:after="60"/>
+      </w:pPr>
+      <w:r>
+        <w:rPr/>
+        <w:t xml:space="preserve">•  </w:t>
+      </w:r>
+      <w:r>
+        <w:rPr>
+          <w:b/>
+        </w:rPr>
+        <w:t xml:space="preserve">Adaptive I/O limit (`--adaptive-io 0.3`).</w:t>
+      </w:r>
+      <w:r>
+        <w:rPr/>
+        <w:t xml:space="preserve"> Every 250 ms the daemon reads the I/O stall time from </w:t>
+      </w:r>
+      <w:r>
+        <w:rPr>
+          <w:rFonts w:ascii="Courier New" w:hAnsi="Courier New"/>
+        </w:rPr>
+        <w:t xml:space="preserve">/proc/pressure/io</w:t>
+      </w:r>
+      <w:r>
+        <w:rPr/>
+        <w:t xml:space="preserve">, works out what fraction of the time tasks were waiting for I/O, and adjusts how many prefetch bytes may be in flight: halved when the fraction is above the target, increased by 8 MB when below (between 1 and 128 MB), as in TCP congestion control.</w:t>
+      </w:r>
+    </w:p>
+    <w:p>
+      <w:pPr>
+        <w:jc w:val="both"/>
+      </w:pPr>
+      <w:r>
+        <w:rPr/>
+        <w:t xml:space="preserve">The memory-pressure experiment of Section 6.2 was repeated with both policies, five runs per configuration:</w:t>
+      </w:r>
+    </w:p>
+    <w:tbl>
+      <w:tblPr>
+        <w:tblW w:w="0" w:type="auto"/>
+        <w:tblBorders>
+          <w:top w:val="single" w:sz="4" w:space="0" w:color="808080"/>
+          <w:left w:val="single" w:sz="4" w:space="0" w:color="808080"/>
+          <w:bottom w:val="single" w:sz="4" w:space="0" w:color="808080"/>
+          <w:right w:val="single" w:sz="4" w:space="0" w:color="808080"/>
+          <w:insideH w:val="single" w:sz="4" w:space="0" w:color="808080"/>
+          <w:insideV w:val="single" w:sz="4" w:space="0" w:color="808080"/>
+        </w:tblBorders>
+        <w:tblCellMar>
+          <w:left w:w="80" w:type="dxa"/>
+          <w:right w:w="80" w:type="dxa"/>
+        </w:tblCellMar>
+      </w:tblPr>
+      <w:tblGrid>
+        <w:gridCol w:w="2300"/>
+        <w:gridCol w:w="1150"/>
+        <w:gridCol w:w="950"/>
+        <w:gridCol w:w="800"/>
+        <w:gridCol w:w="800"/>
+        <w:gridCol w:w="800"/>
+        <w:gridCol w:w="1500"/>
+      </w:tblGrid>
+      <w:tr>
+        <w:tc>
+          <w:tcPr>
+            <w:tcW w:w="2300" w:type="dxa"/>
+            <w:shd w:val="clear" w:color="auto" w:fill="D9E2F3"/>
+          </w:tcPr>
+          <w:p>
+            <w:pPr>
+              <w:spacing w:after="0"/>
+            </w:pPr>
+            <w:r>
+              <w:rPr>
+                <w:b/>
+                <w:sz w:val="19"/>
+              </w:rPr>
+              <w:t xml:space="preserve">Configuration</w:t>
+            </w:r>
+          </w:p>
+        </w:tc>
+        <w:tc>
+          <w:tcPr>
+            <w:tcW w:w="1150" w:type="dxa"/>
+            <w:shd w:val="clear" w:color="auto" w:fill="D9E2F3"/>
+          </w:tcPr>
+          <w:p>
+            <w:pPr>
+              <w:spacing w:after="0"/>
+            </w:pPr>
+            <w:r>
+              <w:rPr>
+                <w:b/>
+                <w:sz w:val="19"/>
+              </w:rPr>
+              <w:t xml:space="preserve">Hit rate</w:t>
+            </w:r>
+          </w:p>
+        </w:tc>
+        <w:tc>
+          <w:tcPr>
+            <w:tcW w:w="950" w:type="dxa"/>
+            <w:shd w:val="clear" w:color="auto" w:fill="D9E2F3"/>
+          </w:tcPr>
+          <w:p>
+            <w:pPr>
+              <w:spacing w:after="0"/>
+            </w:pPr>
+            <w:r>
+              <w:rPr>
+                <w:b/>
+                <w:sz w:val="19"/>
+              </w:rPr>
+              <w:t xml:space="preserve">Reads / run</w:t>
+            </w:r>
+          </w:p>
+        </w:tc>
+        <w:tc>
+          <w:tcPr>
+            <w:tcW w:w="800" w:type="dxa"/>
+            <w:shd w:val="clear" w:color="auto" w:fill="D9E2F3"/>
+          </w:tcPr>
+          <w:p>
+            <w:pPr>
+              <w:spacing w:after="0"/>
+            </w:pPr>
+            <w:r>
+              <w:rPr>
+                <w:b/>
+                <w:sz w:val="19"/>
+              </w:rPr>
+              <w:t xml:space="preserve">p50 (ms)</w:t>
+            </w:r>
+          </w:p>
+        </w:tc>
+        <w:tc>
+          <w:tcPr>
+            <w:tcW w:w="800" w:type="dxa"/>
+            <w:shd w:val="clear" w:color="auto" w:fill="D9E2F3"/>
+          </w:tcPr>
+          <w:p>
+            <w:pPr>
+              <w:spacing w:after="0"/>
+            </w:pPr>
+            <w:r>
+              <w:rPr>
+                <w:b/>
+                <w:sz w:val="19"/>
+              </w:rPr>
+              <w:t xml:space="preserve">p95 (ms)</w:t>
+            </w:r>
+          </w:p>
+        </w:tc>
+        <w:tc>
+          <w:tcPr>
+            <w:tcW w:w="800" w:type="dxa"/>
+            <w:shd w:val="clear" w:color="auto" w:fill="D9E2F3"/>
+          </w:tcPr>
+          <w:p>
+            <w:pPr>
+              <w:spacing w:after="0"/>
+            </w:pPr>
+            <w:r>
+              <w:rPr>
+                <w:b/>
+                <w:sz w:val="19"/>
+              </w:rPr>
+              <w:t xml:space="preserve">p99 (ms)</w:t>
+            </w:r>
+          </w:p>
+        </w:tc>
+        <w:tc>
+          <w:tcPr>
+            <w:tcW w:w="1500" w:type="dxa"/>
+            <w:shd w:val="clear" w:color="auto" w:fill="D9E2F3"/>
+          </w:tcPr>
+          <w:p>
+            <w:pPr>
+              <w:spacing w:after="0"/>
+            </w:pPr>
+            <w:r>
+              <w:rPr>
+                <w:b/>
+                <w:sz w:val="19"/>
+              </w:rPr>
+              <w:t xml:space="preserve">Prefetches (useful)</w:t>
+            </w:r>
+          </w:p>
+        </w:tc>
+      </w:tr>
+      <w:tr>
+        <w:tc>
+          <w:tcPr>
+            <w:tcW w:w="2300" w:type="dxa"/>
+          </w:tcPr>
+          <w:p>
+            <w:pPr>
+              <w:spacing w:after="0"/>
+            </w:pPr>
+            <w:r>
+              <w:rPr>
+                <w:sz w:val="19"/>
+              </w:rPr>
+              <w:t xml:space="preserve">No daemon</w:t>
+            </w:r>
+          </w:p>
+        </w:tc>
+        <w:tc>
+          <w:tcPr>
+            <w:tcW w:w="1150" w:type="dxa"/>
+          </w:tcPr>
+          <w:p>
+            <w:pPr>
+              <w:spacing w:after="0"/>
+            </w:pPr>
+            <w:r>
+              <w:rPr>
+                <w:sz w:val="19"/>
+              </w:rPr>
+              <w:t xml:space="preserve">13.7% ± 0.9</w:t>
+            </w:r>
+          </w:p>
+        </w:tc>
+        <w:tc>
+          <w:tcPr>
+            <w:tcW w:w="950" w:type="dxa"/>
+          </w:tcPr>
+          <w:p>
+            <w:pPr>
+              <w:spacing w:after="0"/>
+            </w:pPr>
+            <w:r>
+              <w:rPr>
+                <w:sz w:val="19"/>
+              </w:rPr>
+              <w:t xml:space="preserve">5589</w:t>
+            </w:r>
+          </w:p>
+        </w:tc>
+        <w:tc>
+          <w:tcPr>
+            <w:tcW w:w="800" w:type="dxa"/>
+          </w:tcPr>
+          <w:p>
+            <w:pPr>
+              <w:spacing w:after="0"/>
+            </w:pPr>
+            <w:r>
+              <w:rPr>
+                <w:sz w:val="19"/>
+              </w:rPr>
+              <w:t xml:space="preserve">9.1</w:t>
+            </w:r>
+          </w:p>
+        </w:tc>
+        <w:tc>
+          <w:tcPr>
+            <w:tcW w:w="800" w:type="dxa"/>
+          </w:tcPr>
+          <w:p>
+            <w:pPr>
+              <w:spacing w:after="0"/>
+            </w:pPr>
+            <w:r>
+              <w:rPr>
+                <w:sz w:val="19"/>
+              </w:rPr>
+              <w:t xml:space="preserve">18.9</w:t>
+            </w:r>
+          </w:p>
+        </w:tc>
+        <w:tc>
+          <w:tcPr>
+            <w:tcW w:w="800" w:type="dxa"/>
+          </w:tcPr>
+          <w:p>
+            <w:pPr>
+              <w:spacing w:after="0"/>
+            </w:pPr>
+            <w:r>
+              <w:rPr>
+                <w:sz w:val="19"/>
+              </w:rPr>
+              <w:t xml:space="preserve">27.3</w:t>
+            </w:r>
+          </w:p>
+        </w:tc>
+        <w:tc>
+          <w:tcPr>
+            <w:tcW w:w="1500" w:type="dxa"/>
+          </w:tcPr>
+          <w:p>
+            <w:pPr>
+              <w:spacing w:after="0"/>
+            </w:pPr>
+          </w:p>
+        </w:tc>
+      </w:tr>
+      <w:tr>
+        <w:tc>
+          <w:tcPr>
+            <w:tcW w:w="2300" w:type="dxa"/>
+          </w:tcPr>
+          <w:p>
+            <w:pPr>
+              <w:spacing w:after="0"/>
+            </w:pPr>
+            <w:r>
+              <w:rPr>
+                <w:sz w:val="19"/>
+              </w:rPr>
+              <w:t xml:space="preserve">Daemon</w:t>
+            </w:r>
+          </w:p>
+        </w:tc>
+        <w:tc>
+          <w:tcPr>
+            <w:tcW w:w="1150" w:type="dxa"/>
+          </w:tcPr>
+          <w:p>
+            <w:pPr>
+              <w:spacing w:after="0"/>
+            </w:pPr>
+            <w:r>
+              <w:rPr>
+                <w:sz w:val="19"/>
+              </w:rPr>
+              <w:t xml:space="preserve">69.7% ± 0.3</w:t>
+            </w:r>
+          </w:p>
+        </w:tc>
+        <w:tc>
+          <w:tcPr>
+            <w:tcW w:w="950" w:type="dxa"/>
+          </w:tcPr>
+          <w:p>
+            <w:pPr>
+              <w:spacing w:after="0"/>
+            </w:pPr>
+            <w:r>
+              <w:rPr>
+                <w:sz w:val="19"/>
+              </w:rPr>
+              <w:t xml:space="preserve">7355</w:t>
+            </w:r>
+          </w:p>
+        </w:tc>
+        <w:tc>
+          <w:tcPr>
+            <w:tcW w:w="800" w:type="dxa"/>
+          </w:tcPr>
+          <w:p>
+            <w:pPr>
+              <w:spacing w:after="0"/>
+            </w:pPr>
+            <w:r>
+              <w:rPr>
+                <w:sz w:val="19"/>
+              </w:rPr>
+              <w:t xml:space="preserve">3.7</w:t>
+            </w:r>
+          </w:p>
+        </w:tc>
+        <w:tc>
+          <w:tcPr>
+            <w:tcW w:w="800" w:type="dxa"/>
+          </w:tcPr>
+          <w:p>
+            <w:pPr>
+              <w:spacing w:after="0"/>
+            </w:pPr>
+            <w:r>
+              <w:rPr>
+                <w:sz w:val="19"/>
+              </w:rPr>
+              <w:t xml:space="preserve">13.6</w:t>
+            </w:r>
+          </w:p>
+        </w:tc>
+        <w:tc>
+          <w:tcPr>
+            <w:tcW w:w="800" w:type="dxa"/>
+          </w:tcPr>
+          <w:p>
+            <w:pPr>
+              <w:spacing w:after="0"/>
+            </w:pPr>
+            <w:r>
+              <w:rPr>
+                <w:sz w:val="19"/>
+              </w:rPr>
+              <w:t xml:space="preserve">20.3</w:t>
+            </w:r>
+          </w:p>
+        </w:tc>
+        <w:tc>
+          <w:tcPr>
+            <w:tcW w:w="1500" w:type="dxa"/>
+          </w:tcPr>
+          <w:p>
+            <w:pPr>
+              <w:spacing w:after="0"/>
+            </w:pPr>
+            <w:r>
+              <w:rPr>
+                <w:sz w:val="19"/>
+              </w:rPr>
+              <w:t xml:space="preserve">4966 (99.9%)</w:t>
+            </w:r>
+          </w:p>
+        </w:tc>
+      </w:tr>
+      <w:tr>
+        <w:tc>
+          <w:tcPr>
+            <w:tcW w:w="2300" w:type="dxa"/>
+          </w:tcPr>
+          <w:p>
+            <w:pPr>
+              <w:spacing w:after="0"/>
+            </w:pPr>
+            <w:r>
+              <w:rPr>
+                <w:sz w:val="19"/>
+              </w:rPr>
+              <w:t xml:space="preserve">Daemon + dead-file eviction</w:t>
+            </w:r>
+          </w:p>
+        </w:tc>
+        <w:tc>
+          <w:tcPr>
+            <w:tcW w:w="1150" w:type="dxa"/>
+          </w:tcPr>
+          <w:p>
+            <w:pPr>
+              <w:spacing w:after="0"/>
+            </w:pPr>
+            <w:r>
+              <w:rPr>
+                <w:sz w:val="19"/>
+              </w:rPr>
+              <w:t xml:space="preserve">64.6% ± 1.0</w:t>
+            </w:r>
+          </w:p>
+        </w:tc>
+        <w:tc>
+          <w:tcPr>
+            <w:tcW w:w="950" w:type="dxa"/>
+          </w:tcPr>
+          <w:p>
+            <w:pPr>
+              <w:spacing w:after="0"/>
+            </w:pPr>
+            <w:r>
+              <w:rPr>
+                <w:sz w:val="19"/>
+              </w:rPr>
+              <w:t xml:space="preserve">7727</w:t>
+            </w:r>
+          </w:p>
+        </w:tc>
+        <w:tc>
+          <w:tcPr>
+            <w:tcW w:w="800" w:type="dxa"/>
+          </w:tcPr>
+          <w:p>
+            <w:pPr>
+              <w:spacing w:after="0"/>
+            </w:pPr>
+            <w:r>
+              <w:rPr>
+                <w:sz w:val="19"/>
+              </w:rPr>
+              <w:t xml:space="preserve">3.6</w:t>
+            </w:r>
+          </w:p>
+        </w:tc>
+        <w:tc>
+          <w:tcPr>
+            <w:tcW w:w="800" w:type="dxa"/>
+          </w:tcPr>
+          <w:p>
+            <w:pPr>
+              <w:spacing w:after="0"/>
+            </w:pPr>
+            <w:r>
+              <w:rPr>
+                <w:sz w:val="19"/>
+              </w:rPr>
+              <w:t xml:space="preserve">11.5</w:t>
+            </w:r>
+          </w:p>
+        </w:tc>
+        <w:tc>
+          <w:tcPr>
+            <w:tcW w:w="800" w:type="dxa"/>
+          </w:tcPr>
+          <w:p>
+            <w:pPr>
+              <w:spacing w:after="0"/>
+            </w:pPr>
+            <w:r>
+              <w:rPr>
+                <w:sz w:val="19"/>
+              </w:rPr>
+              <w:t xml:space="preserve">18.1</w:t>
+            </w:r>
+          </w:p>
+        </w:tc>
+        <w:tc>
+          <w:tcPr>
+            <w:tcW w:w="1500" w:type="dxa"/>
+          </w:tcPr>
+          <w:p>
+            <w:pPr>
+              <w:spacing w:after="0"/>
+            </w:pPr>
+            <w:r>
+              <w:rPr>
+                <w:sz w:val="19"/>
+              </w:rPr>
+              <w:t xml:space="preserve">5100 (98.7%)</w:t>
+            </w:r>
+          </w:p>
+        </w:tc>
+      </w:tr>
+      <w:tr>
+        <w:tc>
+          <w:tcPr>
+            <w:tcW w:w="2300" w:type="dxa"/>
+          </w:tcPr>
+          <w:p>
+            <w:pPr>
+              <w:spacing w:after="0"/>
+            </w:pPr>
+            <w:r>
+              <w:rPr>
+                <w:sz w:val="19"/>
+              </w:rPr>
+              <w:t xml:space="preserve">Daemon + adaptive I/O limit</w:t>
+            </w:r>
+          </w:p>
+        </w:tc>
+        <w:tc>
+          <w:tcPr>
+            <w:tcW w:w="1150" w:type="dxa"/>
+          </w:tcPr>
+          <w:p>
+            <w:pPr>
+              <w:spacing w:after="0"/>
+            </w:pPr>
+            <w:r>
+              <w:rPr>
+                <w:sz w:val="19"/>
+              </w:rPr>
+              <w:t xml:space="preserve">69.8% ± 0.3</w:t>
+            </w:r>
+          </w:p>
+        </w:tc>
+        <w:tc>
+          <w:tcPr>
+            <w:tcW w:w="950" w:type="dxa"/>
+          </w:tcPr>
+          <w:p>
+            <w:pPr>
+              <w:spacing w:after="0"/>
+            </w:pPr>
+            <w:r>
+              <w:rPr>
+                <w:sz w:val="19"/>
+              </w:rPr>
+              <w:t xml:space="preserve">7296</w:t>
+            </w:r>
+          </w:p>
+        </w:tc>
+        <w:tc>
+          <w:tcPr>
+            <w:tcW w:w="800" w:type="dxa"/>
+          </w:tcPr>
+          <w:p>
+            <w:pPr>
+              <w:spacing w:after="0"/>
+            </w:pPr>
+            <w:r>
+              <w:rPr>
+                <w:sz w:val="19"/>
+              </w:rPr>
+              <w:t xml:space="preserve">3.9</w:t>
+            </w:r>
+          </w:p>
+        </w:tc>
+        <w:tc>
+          <w:tcPr>
+            <w:tcW w:w="800" w:type="dxa"/>
+          </w:tcPr>
+          <w:p>
+            <w:pPr>
+              <w:spacing w:after="0"/>
+            </w:pPr>
+            <w:r>
+              <w:rPr>
+                <w:sz w:val="19"/>
+              </w:rPr>
+              <w:t xml:space="preserve">13.8</w:t>
+            </w:r>
+          </w:p>
+        </w:tc>
+        <w:tc>
+          <w:tcPr>
+            <w:tcW w:w="800" w:type="dxa"/>
+          </w:tcPr>
+          <w:p>
+            <w:pPr>
+              <w:spacing w:after="0"/>
+            </w:pPr>
+            <w:r>
+              <w:rPr>
+                <w:sz w:val="19"/>
+              </w:rPr>
+              <w:t xml:space="preserve">20.4</w:t>
+            </w:r>
+          </w:p>
+        </w:tc>
+        <w:tc>
+          <w:tcPr>
+            <w:tcW w:w="1500" w:type="dxa"/>
+          </w:tcPr>
+          <w:p>
+            <w:pPr>
+              <w:spacing w:after="0"/>
+            </w:pPr>
+            <w:r>
+              <w:rPr>
+                <w:sz w:val="19"/>
+              </w:rPr>
+              <w:t xml:space="preserve">4946 (99.9%)</w:t>
+            </w:r>
+          </w:p>
+        </w:tc>
+      </w:tr>
+    </w:tbl>
+    <w:p/>
+    <w:p>
+      <w:pPr>
+        <w:jc w:val="both"/>
+      </w:pPr>
+      <w:r>
+        <w:rPr/>
+        <w:t xml:space="preserve">The plain daemon reproduced the earlier gain: throughput +32% (95% CI +29% to +35%, p &lt; 0.001). Dead-file eviction dropped 6356 files after use in one 40-second run and was better than the plain daemon: throughput +5% (95% CI +3% to +7%, p = 0.004) and p99 latency -11% (95% CI -19% to -3%, p = 0.017), or +38% (95% CI +35% to +42%, p &lt; 0.001) over no daemon. Its hit rate was lower (64.6% against 69.7%), so the gain is not from keeping more data in memory. The likely reason, not measured directly, is that pages freed at close are available at once for the next prefetch and read, which would otherwise wait for the kernel to reclaim memory.</w:t>
+      </w:r>
+    </w:p>
+    <w:p>
+      <w:pPr>
+        <w:jc w:val="both"/>
+      </w:pPr>
+      <w:r>
+        <w:rPr/>
+        <w:t xml:space="preserve">The adaptive limit made no practical difference under memory pressure (it cut its window 6 times in 156 checks), which is correct because the disk was not the bottleneck there. On the slow disk with 10 ms of think time (Section 6.4) it removed the tail-latency cost, p99 -57% (95% CI -82% to -31%, p = 0.006) against the plain daemon, but only by cutting the window 205 times in 209 checks to about 1.5 MB, which also removed the median gain. The stall fraction stayed above the target even when almost nothing was being prefetched, so the controller could only switch prefetching off. It works as a safety valve; choosing the target from the stall level measured without prefetching is the obvious improvement.</w:t>
+      </w:r>
+    </w:p>
+    <w:p>
+      <w:pPr>
+        <w:jc w:val="both"/>
+      </w:pPr>
+      <w:r>
+        <w:rPr/>
+        <w:t xml:space="preserve">Dead-file eviction was also tried on the real programs, where it cannot help because their files fit in memory. At 300 MB the cgroup's out-of-memory killer stopped a 196 MB Python process (the size of the daemon) in both attempts, while the plain daemon survived the same limit. The daemon's memory grows on this workload with or without eviction (about 195 to 265 MB in 45 seconds without a limit), so there is little headroom, but the exact reason eviction tips it over was not found. At 400 MB it ran, dropped 85006 files in a run, and made no significant difference compared with the plain daemon (throughput -3% (95% CI -7% to +1%, p = 0.123)).</w:t>
+      </w:r>
+    </w:p>
+    <w:p>
+      <w:pPr>
+        <w:pStyle w:val="Heading2"/>
+      </w:pPr>
+      <w:r>
+        <w:rPr/>
+        <w:t xml:space="preserve">6.10 A second machine</w:t>
+      </w:r>
+    </w:p>
+    <w:p>
+      <w:pPr>
+        <w:jc w:val="both"/>
+      </w:pPr>
+      <w:r>
+        <w:rPr/>
+        <w:t xml:space="preserve">To check that the results are not specific to one machine, the memory-pressure experiment was repeated on a smaller VM: 2 virtual CPUs and 3.9 GB of RAM, the same kernel and BCC version, a 6 GB data set and no ballast, so the working set does not fit in memory naturally. Five runs per configuration:</w:t>
+      </w:r>
+    </w:p>
+    <w:tbl>
+      <w:tblPr>
+        <w:tblW w:w="0" w:type="auto"/>
+        <w:tblBorders>
+          <w:top w:val="single" w:sz="4" w:space="0" w:color="808080"/>
+          <w:left w:val="single" w:sz="4" w:space="0" w:color="808080"/>
+          <w:bottom w:val="single" w:sz="4" w:space="0" w:color="808080"/>
+          <w:right w:val="single" w:sz="4" w:space="0" w:color="808080"/>
+          <w:insideH w:val="single" w:sz="4" w:space="0" w:color="808080"/>
+          <w:insideV w:val="single" w:sz="4" w:space="0" w:color="808080"/>
+        </w:tblBorders>
+        <w:tblCellMar>
+          <w:left w:w="80" w:type="dxa"/>
+          <w:right w:w="80" w:type="dxa"/>
+        </w:tblCellMar>
+      </w:tblPr>
+      <w:tblGrid>
+        <w:gridCol w:w="2300"/>
+        <w:gridCol w:w="1150"/>
+        <w:gridCol w:w="950"/>
+        <w:gridCol w:w="800"/>
+        <w:gridCol w:w="800"/>
+        <w:gridCol w:w="800"/>
+        <w:gridCol w:w="1500"/>
+      </w:tblGrid>
+      <w:tr>
+        <w:tc>
+          <w:tcPr>
+            <w:tcW w:w="2300" w:type="dxa"/>
+            <w:shd w:val="clear" w:color="auto" w:fill="D9E2F3"/>
+          </w:tcPr>
+          <w:p>
+            <w:pPr>
+              <w:spacing w:after="0"/>
+            </w:pPr>
+            <w:r>
+              <w:rPr>
+                <w:b/>
+                <w:sz w:val="19"/>
+              </w:rPr>
+              <w:t xml:space="preserve">Configuration</w:t>
+            </w:r>
+          </w:p>
+        </w:tc>
+        <w:tc>
+          <w:tcPr>
+            <w:tcW w:w="1150" w:type="dxa"/>
+            <w:shd w:val="clear" w:color="auto" w:fill="D9E2F3"/>
+          </w:tcPr>
+          <w:p>
+            <w:pPr>
+              <w:spacing w:after="0"/>
+            </w:pPr>
+            <w:r>
+              <w:rPr>
+                <w:b/>
+                <w:sz w:val="19"/>
+              </w:rPr>
+              <w:t xml:space="preserve">Hit rate</w:t>
+            </w:r>
+          </w:p>
+        </w:tc>
+        <w:tc>
+          <w:tcPr>
+            <w:tcW w:w="950" w:type="dxa"/>
+            <w:shd w:val="clear" w:color="auto" w:fill="D9E2F3"/>
+          </w:tcPr>
+          <w:p>
+            <w:pPr>
+              <w:spacing w:after="0"/>
+            </w:pPr>
+            <w:r>
+              <w:rPr>
+                <w:b/>
+                <w:sz w:val="19"/>
+              </w:rPr>
+              <w:t xml:space="preserve">Reads / run</w:t>
+            </w:r>
+          </w:p>
+        </w:tc>
+        <w:tc>
+          <w:tcPr>
+            <w:tcW w:w="800" w:type="dxa"/>
+            <w:shd w:val="clear" w:color="auto" w:fill="D9E2F3"/>
+          </w:tcPr>
+          <w:p>
+            <w:pPr>
+              <w:spacing w:after="0"/>
+            </w:pPr>
+            <w:r>
+              <w:rPr>
+                <w:b/>
+                <w:sz w:val="19"/>
+              </w:rPr>
+              <w:t xml:space="preserve">p50 (ms)</w:t>
+            </w:r>
+          </w:p>
+        </w:tc>
+        <w:tc>
+          <w:tcPr>
+            <w:tcW w:w="800" w:type="dxa"/>
+            <w:shd w:val="clear" w:color="auto" w:fill="D9E2F3"/>
+          </w:tcPr>
+          <w:p>
+            <w:pPr>
+              <w:spacing w:after="0"/>
+            </w:pPr>
+            <w:r>
+              <w:rPr>
+                <w:b/>
+                <w:sz w:val="19"/>
+              </w:rPr>
+              <w:t xml:space="preserve">p95 (ms)</w:t>
+            </w:r>
+          </w:p>
+        </w:tc>
+        <w:tc>
+          <w:tcPr>
+            <w:tcW w:w="800" w:type="dxa"/>
+            <w:shd w:val="clear" w:color="auto" w:fill="D9E2F3"/>
+          </w:tcPr>
+          <w:p>
+            <w:pPr>
+              <w:spacing w:after="0"/>
+            </w:pPr>
+            <w:r>
+              <w:rPr>
+                <w:b/>
+                <w:sz w:val="19"/>
+              </w:rPr>
+              <w:t xml:space="preserve">p99 (ms)</w:t>
+            </w:r>
+          </w:p>
+        </w:tc>
+        <w:tc>
+          <w:tcPr>
+            <w:tcW w:w="1500" w:type="dxa"/>
+            <w:shd w:val="clear" w:color="auto" w:fill="D9E2F3"/>
+          </w:tcPr>
+          <w:p>
+            <w:pPr>
+              <w:spacing w:after="0"/>
+            </w:pPr>
+            <w:r>
+              <w:rPr>
+                <w:b/>
+                <w:sz w:val="19"/>
+              </w:rPr>
+              <w:t xml:space="preserve">Prefetches (useful)</w:t>
+            </w:r>
+          </w:p>
+        </w:tc>
+      </w:tr>
+      <w:tr>
+        <w:tc>
+          <w:tcPr>
+            <w:tcW w:w="2300" w:type="dxa"/>
+          </w:tcPr>
+          <w:p>
+            <w:pPr>
+              <w:spacing w:after="0"/>
+            </w:pPr>
+            <w:r>
+              <w:rPr>
+                <w:sz w:val="19"/>
+              </w:rPr>
+              <w:t xml:space="preserve">No daemon</w:t>
+            </w:r>
+          </w:p>
+        </w:tc>
+        <w:tc>
+          <w:tcPr>
+            <w:tcW w:w="1150" w:type="dxa"/>
+          </w:tcPr>
+          <w:p>
+            <w:pPr>
+              <w:spacing w:after="0"/>
+            </w:pPr>
+            <w:r>
+              <w:rPr>
+                <w:sz w:val="19"/>
+              </w:rPr>
+              <w:t xml:space="preserve">39.3% ± 0.1</w:t>
+            </w:r>
+          </w:p>
+        </w:tc>
+        <w:tc>
+          <w:tcPr>
+            <w:tcW w:w="950" w:type="dxa"/>
+          </w:tcPr>
+          <w:p>
+            <w:pPr>
+              <w:spacing w:after="0"/>
+            </w:pPr>
+            <w:r>
+              <w:rPr>
+                <w:sz w:val="19"/>
+              </w:rPr>
+              <w:t xml:space="preserve">8029</w:t>
+            </w:r>
+          </w:p>
+        </w:tc>
+        <w:tc>
+          <w:tcPr>
+            <w:tcW w:w="800" w:type="dxa"/>
+          </w:tcPr>
+          <w:p>
+            <w:pPr>
+              <w:spacing w:after="0"/>
+            </w:pPr>
+            <w:r>
+              <w:rPr>
+                <w:sz w:val="19"/>
+              </w:rPr>
+              <w:t xml:space="preserve">3.7</w:t>
+            </w:r>
+          </w:p>
+        </w:tc>
+        <w:tc>
+          <w:tcPr>
+            <w:tcW w:w="800" w:type="dxa"/>
+          </w:tcPr>
+          <w:p>
+            <w:pPr>
+              <w:spacing w:after="0"/>
+            </w:pPr>
+            <w:r>
+              <w:rPr>
+                <w:sz w:val="19"/>
+              </w:rPr>
+              <w:t xml:space="preserve">7.4</w:t>
+            </w:r>
+          </w:p>
+        </w:tc>
+        <w:tc>
+          <w:tcPr>
+            <w:tcW w:w="800" w:type="dxa"/>
+          </w:tcPr>
+          <w:p>
+            <w:pPr>
+              <w:spacing w:after="0"/>
+            </w:pPr>
+            <w:r>
+              <w:rPr>
+                <w:sz w:val="19"/>
+              </w:rPr>
+              <w:t xml:space="preserve">10.8</w:t>
+            </w:r>
+          </w:p>
+        </w:tc>
+        <w:tc>
+          <w:tcPr>
+            <w:tcW w:w="1500" w:type="dxa"/>
+          </w:tcPr>
+          <w:p>
+            <w:pPr>
+              <w:spacing w:after="0"/>
+            </w:pPr>
+          </w:p>
+        </w:tc>
+      </w:tr>
+      <w:tr>
+        <w:tc>
+          <w:tcPr>
+            <w:tcW w:w="2300" w:type="dxa"/>
+          </w:tcPr>
+          <w:p>
+            <w:pPr>
+              <w:spacing w:after="0"/>
+            </w:pPr>
+            <w:r>
+              <w:rPr>
+                <w:sz w:val="19"/>
+              </w:rPr>
+              <w:t xml:space="preserve">Daemon</w:t>
+            </w:r>
+          </w:p>
+        </w:tc>
+        <w:tc>
+          <w:tcPr>
+            <w:tcW w:w="1150" w:type="dxa"/>
+          </w:tcPr>
+          <w:p>
+            <w:pPr>
+              <w:spacing w:after="0"/>
+            </w:pPr>
+            <w:r>
+              <w:rPr>
+                <w:sz w:val="19"/>
+              </w:rPr>
+              <w:t xml:space="preserve">61.5% ± 0.2</w:t>
+            </w:r>
+          </w:p>
+        </w:tc>
+        <w:tc>
+          <w:tcPr>
+            <w:tcW w:w="950" w:type="dxa"/>
+          </w:tcPr>
+          <w:p>
+            <w:pPr>
+              <w:spacing w:after="0"/>
+            </w:pPr>
+            <w:r>
+              <w:rPr>
+                <w:sz w:val="19"/>
+              </w:rPr>
+              <w:t xml:space="preserve">8076</w:t>
+            </w:r>
+          </w:p>
+        </w:tc>
+        <w:tc>
+          <w:tcPr>
+            <w:tcW w:w="800" w:type="dxa"/>
+          </w:tcPr>
+          <w:p>
+            <w:pPr>
+              <w:spacing w:after="0"/>
+            </w:pPr>
+            <w:r>
+              <w:rPr>
+                <w:sz w:val="19"/>
+              </w:rPr>
+              <w:t xml:space="preserve">3.5</w:t>
+            </w:r>
+          </w:p>
+        </w:tc>
+        <w:tc>
+          <w:tcPr>
+            <w:tcW w:w="800" w:type="dxa"/>
+          </w:tcPr>
+          <w:p>
+            <w:pPr>
+              <w:spacing w:after="0"/>
+            </w:pPr>
+            <w:r>
+              <w:rPr>
+                <w:sz w:val="19"/>
+              </w:rPr>
+              <w:t xml:space="preserve">7.2</w:t>
+            </w:r>
+          </w:p>
+        </w:tc>
+        <w:tc>
+          <w:tcPr>
+            <w:tcW w:w="800" w:type="dxa"/>
+          </w:tcPr>
+          <w:p>
+            <w:pPr>
+              <w:spacing w:after="0"/>
+            </w:pPr>
+            <w:r>
+              <w:rPr>
+                <w:sz w:val="19"/>
+              </w:rPr>
+              <w:t xml:space="preserve">10.8</w:t>
+            </w:r>
+          </w:p>
+        </w:tc>
+        <w:tc>
+          <w:tcPr>
+            <w:tcW w:w="1500" w:type="dxa"/>
+          </w:tcPr>
+          <w:p>
+            <w:pPr>
+              <w:spacing w:after="0"/>
+            </w:pPr>
+            <w:r>
+              <w:rPr>
+                <w:sz w:val="19"/>
+              </w:rPr>
+              <w:t xml:space="preserve">3119 (99.8%)</w:t>
+            </w:r>
+          </w:p>
+        </w:tc>
+      </w:tr>
+      <w:tr>
+        <w:tc>
+          <w:tcPr>
+            <w:tcW w:w="2300" w:type="dxa"/>
+          </w:tcPr>
+          <w:p>
+            <w:pPr>
+              <w:spacing w:after="0"/>
+            </w:pPr>
+            <w:r>
+              <w:rPr>
+                <w:sz w:val="19"/>
+              </w:rPr>
+              <w:t xml:space="preserve">Daemon + precision gate</w:t>
+            </w:r>
+          </w:p>
+        </w:tc>
+        <w:tc>
+          <w:tcPr>
+            <w:tcW w:w="1150" w:type="dxa"/>
+          </w:tcPr>
+          <w:p>
+            <w:pPr>
+              <w:spacing w:after="0"/>
+            </w:pPr>
+            <w:r>
+              <w:rPr>
+                <w:sz w:val="19"/>
+              </w:rPr>
+              <w:t xml:space="preserve">61.6% ± 0.1</w:t>
+            </w:r>
+          </w:p>
+        </w:tc>
+        <w:tc>
+          <w:tcPr>
+            <w:tcW w:w="950" w:type="dxa"/>
+          </w:tcPr>
+          <w:p>
+            <w:pPr>
+              <w:spacing w:after="0"/>
+            </w:pPr>
+            <w:r>
+              <w:rPr>
+                <w:sz w:val="19"/>
+              </w:rPr>
+              <w:t xml:space="preserve">7996</w:t>
+            </w:r>
+          </w:p>
+        </w:tc>
+        <w:tc>
+          <w:tcPr>
+            <w:tcW w:w="800" w:type="dxa"/>
+          </w:tcPr>
+          <w:p>
+            <w:pPr>
+              <w:spacing w:after="0"/>
+            </w:pPr>
+            <w:r>
+              <w:rPr>
+                <w:sz w:val="19"/>
+              </w:rPr>
+              <w:t xml:space="preserve">3.6</w:t>
+            </w:r>
+          </w:p>
+        </w:tc>
+        <w:tc>
+          <w:tcPr>
+            <w:tcW w:w="800" w:type="dxa"/>
+          </w:tcPr>
+          <w:p>
+            <w:pPr>
+              <w:spacing w:after="0"/>
+            </w:pPr>
+            <w:r>
+              <w:rPr>
+                <w:sz w:val="19"/>
+              </w:rPr>
+              <w:t xml:space="preserve">7.5</w:t>
+            </w:r>
+          </w:p>
+        </w:tc>
+        <w:tc>
+          <w:tcPr>
+            <w:tcW w:w="800" w:type="dxa"/>
+          </w:tcPr>
+          <w:p>
+            <w:pPr>
+              <w:spacing w:after="0"/>
+            </w:pPr>
+            <w:r>
+              <w:rPr>
+                <w:sz w:val="19"/>
+              </w:rPr>
+              <w:t xml:space="preserve">10.9</w:t>
+            </w:r>
+          </w:p>
+        </w:tc>
+        <w:tc>
+          <w:tcPr>
+            <w:tcW w:w="1500" w:type="dxa"/>
+          </w:tcPr>
+          <w:p>
+            <w:pPr>
+              <w:spacing w:after="0"/>
+            </w:pPr>
+            <w:r>
+              <w:rPr>
+                <w:sz w:val="19"/>
+              </w:rPr>
+              <w:t xml:space="preserve">3071 (99.9%)</w:t>
+            </w:r>
+          </w:p>
+        </w:tc>
+      </w:tr>
+      <w:tr>
+        <w:tc>
+          <w:tcPr>
+            <w:tcW w:w="2300" w:type="dxa"/>
+          </w:tcPr>
+          <w:p>
+            <w:pPr>
+              <w:spacing w:after="0"/>
+            </w:pPr>
+            <w:r>
+              <w:rPr>
+                <w:sz w:val="19"/>
+              </w:rPr>
+              <w:t xml:space="preserve">Daemon + dead-file eviction</w:t>
+            </w:r>
+          </w:p>
+        </w:tc>
+        <w:tc>
+          <w:tcPr>
+            <w:tcW w:w="1150" w:type="dxa"/>
+          </w:tcPr>
+          <w:p>
+            <w:pPr>
+              <w:spacing w:after="0"/>
+            </w:pPr>
+            <w:r>
+              <w:rPr>
+                <w:sz w:val="19"/>
+              </w:rPr>
+              <w:t xml:space="preserve">32.0% ± 1.7</w:t>
+            </w:r>
+          </w:p>
+        </w:tc>
+        <w:tc>
+          <w:tcPr>
+            <w:tcW w:w="950" w:type="dxa"/>
+          </w:tcPr>
+          <w:p>
+            <w:pPr>
+              <w:spacing w:after="0"/>
+            </w:pPr>
+            <w:r>
+              <w:rPr>
+                <w:sz w:val="19"/>
+              </w:rPr>
+              <w:t xml:space="preserve">8552</w:t>
+            </w:r>
+          </w:p>
+        </w:tc>
+        <w:tc>
+          <w:tcPr>
+            <w:tcW w:w="800" w:type="dxa"/>
+          </w:tcPr>
+          <w:p>
+            <w:pPr>
+              <w:spacing w:after="0"/>
+            </w:pPr>
+            <w:r>
+              <w:rPr>
+                <w:sz w:val="19"/>
+              </w:rPr>
+              <w:t xml:space="preserve">3.2</w:t>
+            </w:r>
+          </w:p>
+        </w:tc>
+        <w:tc>
+          <w:tcPr>
+            <w:tcW w:w="800" w:type="dxa"/>
+          </w:tcPr>
+          <w:p>
+            <w:pPr>
+              <w:spacing w:after="0"/>
+            </w:pPr>
+            <w:r>
+              <w:rPr>
+                <w:sz w:val="19"/>
+              </w:rPr>
+              <w:t xml:space="preserve">6.8</w:t>
+            </w:r>
+          </w:p>
+        </w:tc>
+        <w:tc>
+          <w:tcPr>
+            <w:tcW w:w="800" w:type="dxa"/>
+          </w:tcPr>
+          <w:p>
+            <w:pPr>
+              <w:spacing w:after="0"/>
+            </w:pPr>
+            <w:r>
+              <w:rPr>
+                <w:sz w:val="19"/>
+              </w:rPr>
+              <w:t xml:space="preserve">11.6</w:t>
+            </w:r>
+          </w:p>
+        </w:tc>
+        <w:tc>
+          <w:tcPr>
+            <w:tcW w:w="1500" w:type="dxa"/>
+          </w:tcPr>
+          <w:p>
+            <w:pPr>
+              <w:spacing w:after="0"/>
+            </w:pPr>
+            <w:r>
+              <w:rPr>
+                <w:sz w:val="19"/>
+              </w:rPr>
+              <w:t xml:space="preserve">2715 (99.9%)</w:t>
+            </w:r>
+          </w:p>
+        </w:tc>
+      </w:tr>
+      <w:tr>
+        <w:tc>
+          <w:tcPr>
+            <w:tcW w:w="2300" w:type="dxa"/>
+          </w:tcPr>
+          <w:p>
+            <w:pPr>
+              <w:spacing w:after="0"/>
+            </w:pPr>
+            <w:r>
+              <w:rPr>
+                <w:sz w:val="19"/>
+              </w:rPr>
+              <w:t xml:space="preserve">Daemon + adaptive I/O limit</w:t>
+            </w:r>
+          </w:p>
+        </w:tc>
+        <w:tc>
+          <w:tcPr>
+            <w:tcW w:w="1150" w:type="dxa"/>
+          </w:tcPr>
+          <w:p>
+            <w:pPr>
+              <w:spacing w:after="0"/>
+            </w:pPr>
+            <w:r>
+              <w:rPr>
+                <w:sz w:val="19"/>
+              </w:rPr>
+              <w:t xml:space="preserve">61.8% ± 0.3</w:t>
+            </w:r>
+          </w:p>
+        </w:tc>
+        <w:tc>
+          <w:tcPr>
+            <w:tcW w:w="950" w:type="dxa"/>
+          </w:tcPr>
+          <w:p>
+            <w:pPr>
+              <w:spacing w:after="0"/>
+            </w:pPr>
+            <w:r>
+              <w:rPr>
+                <w:sz w:val="19"/>
+              </w:rPr>
+              <w:t xml:space="preserve">8107</w:t>
+            </w:r>
+          </w:p>
+        </w:tc>
+        <w:tc>
+          <w:tcPr>
+            <w:tcW w:w="800" w:type="dxa"/>
+          </w:tcPr>
+          <w:p>
+            <w:pPr>
+              <w:spacing w:after="0"/>
+            </w:pPr>
+            <w:r>
+              <w:rPr>
+                <w:sz w:val="19"/>
+              </w:rPr>
+              <w:t xml:space="preserve">3.5</w:t>
+            </w:r>
+          </w:p>
+        </w:tc>
+        <w:tc>
+          <w:tcPr>
+            <w:tcW w:w="800" w:type="dxa"/>
+          </w:tcPr>
+          <w:p>
+            <w:pPr>
+              <w:spacing w:after="0"/>
+            </w:pPr>
+            <w:r>
+              <w:rPr>
+                <w:sz w:val="19"/>
+              </w:rPr>
+              <w:t xml:space="preserve">6.9</w:t>
+            </w:r>
+          </w:p>
+        </w:tc>
+        <w:tc>
+          <w:tcPr>
+            <w:tcW w:w="800" w:type="dxa"/>
+          </w:tcPr>
+          <w:p>
+            <w:pPr>
+              <w:spacing w:after="0"/>
+            </w:pPr>
+            <w:r>
+              <w:rPr>
+                <w:sz w:val="19"/>
+              </w:rPr>
+              <w:t xml:space="preserve">10.5</w:t>
+            </w:r>
+          </w:p>
+        </w:tc>
+        <w:tc>
+          <w:tcPr>
+            <w:tcW w:w="1500" w:type="dxa"/>
+          </w:tcPr>
+          <w:p>
+            <w:pPr>
+              <w:spacing w:after="0"/>
+            </w:pPr>
+            <w:r>
+              <w:rPr>
+                <w:sz w:val="19"/>
+              </w:rPr>
+              <w:t xml:space="preserve">3086 (99.9%)</w:t>
+            </w:r>
+          </w:p>
+        </w:tc>
+      </w:tr>
+    </w:tbl>
+    <w:p/>
+    <w:p>
+      <w:pPr>
+        <w:jc w:val="both"/>
+      </w:pPr>
+      <w:r>
+        <w:rPr/>
+        <w:t xml:space="preserve">The daemon raised the hit rate from 39.3% to 61.5%, but throughput changed by +1% (95% CI -1% to +2%, p = 0.413), which is not significant. With two CPUs shared by three readers and the daemon, the likely bottleneck is the CPU work of copying data out of the cache rather than waiting for the disk (CPU use was not measured), so faster reads do not lead to more reads. This matches the real-program result: prefetching only pays when the disk is the bottleneck. With 30% random accesses on this machine nothing was significant either: throughput -1% (95% CI -3% to +0%, p = 0.091), p99 +9% (95% CI -0% to +17%, p = 0.051).</w:t>
+      </w:r>
+    </w:p>
+    <w:p>
+      <w:pPr>
+        <w:jc w:val="both"/>
+      </w:pPr>
+      <w:r>
+        <w:rPr/>
+        <w:t xml:space="preserve">Dead-file eviction repeated its gain over the plain daemon: throughput +6% (95% CI +3% to +9%, p = 0.004) and median latency -9% (95% CI -13% to -6%, p &lt; 0.001), although its hit rate fell to 32.0%, below the no-daemon level. Less data cached but more work done supports the explanation that freeing pages at close saves the kernel the work of reclaiming memory, which matters more on a machine short of CPU.</w:t>
+      </w:r>
+    </w:p>
+    <w:p>
+      <w:pPr>
         <w:pStyle w:val="Heading1"/>
       </w:pPr>
       <w:r>
@@ -4675,7 +8728,7 @@
       </w:r>
       <w:r>
         <w:rPr/>
-        <w:t xml:space="preserve">Everything ran on one virtual machine with 3 to 5 runs per configuration and 40 to 60 seconds per run.</w:t>
+        <w:t xml:space="preserve">Everything ran on virtual machines on one Mac (4 vCPU / 12 GB and 2 vCPU / 4 GB), with 4 to 5 runs per configuration and 40 to 60 seconds per run.</w:t>
       </w:r>
     </w:p>
     <w:p>
@@ -4745,7 +8798,7 @@
       </w:r>
       <w:r>
         <w:rPr/>
-        <w:t xml:space="preserve">The precision gate is implemented and unit-tested; its effect on performance has not been measured yet, so no benefit is claimed for it.</w:t>
+        <w:t xml:space="preserve">The precision gate is implemented and unit-tested; its effect is reported in Section 6.7.</w:t>
       </w:r>
     </w:p>
     <w:p>

</xml_diff>

<commit_message>
Results: tracing only chosen programs removes the real-program cost; eviction's reclaim saving measured
- Real programs (v9): with all programs traced the optimised daemon still costs (300 MB: search +77%);
  tracing only the build (--only-comm make,cc1) leaves no program significantly slower
- Memory pressure with reclaim counters: dead-file eviction cuts pages scanned by reclaim by 95% and
  direct-reclaim stalls from 222 to 0 per run versus the plain daemon; throughput +4% (third replication)
- Automatic I/O target: measured stall 0.62, target 0.72, tail cost unchanged; stall time is the wrong
  signal on a busy disk
- evaluation_v3, statistics, README, report and website updated; v9 logs added
</commit_message>
<xml_diff>
--- a/report/Project_Report.docx
+++ b/report/Project_Report.docx
@@ -7783,7 +7783,7 @@
       </w:pPr>
       <w:r>
         <w:rPr/>
-        <w:t xml:space="preserve">The plain daemon reproduced the earlier gain: throughput +32% (95% CI +29% to +35%, p &lt; 0.001). Dead-file eviction dropped 6356 files after use in one 40-second run and was better than the plain daemon: throughput +5% (95% CI +3% to +7%, p = 0.004) and p99 latency -11% (95% CI -19% to -3%, p = 0.017), or +38% (95% CI +35% to +42%, p &lt; 0.001) over no daemon. Its hit rate was lower (64.6% against 69.7%), so the gain is not from keeping more data in memory. The likely reason, not measured directly, is that pages freed at close are available at once for the next prefetch and read, which would otherwise wait for the kernel to reclaim memory.</w:t>
+        <w:t xml:space="preserve">The plain daemon reproduced the earlier gain: throughput +32% (95% CI +29% to +35%, p &lt; 0.001). Dead-file eviction dropped 6356 files after use in one 40-second run and was better than the plain daemon: throughput +5% (95% CI +3% to +7%, p = 0.004) and p99 latency -11% (95% CI -19% to -3%, p = 0.017), or +38% (95% CI +35% to +42%, p &lt; 0.001) over no daemon. Its hit rate was lower (64.6% against 69.7%), so the gain is not from keeping more data in memory. The reason, measured in Section 6.11, is that pages freed at close are available at once for the next prefetch and read, which would otherwise wait for the kernel to reclaim memory.</w:t>
       </w:r>
     </w:p>
     <w:p>
@@ -8557,6 +8557,707 @@
       <w:r>
         <w:rPr/>
         <w:t xml:space="preserve">Dead-file eviction repeated its gain over the plain daemon: throughput +6% (95% CI +3% to +9%, p = 0.004) and median latency -9% (95% CI -13% to -6%, p &lt; 0.001), although its hit rate fell to 32.0%, below the no-daemon level. Less data cached but more work done supports the explanation that freeing pages at close saves the kernel the work of reclaiming memory, which matters more on a machine short of CPU.</w:t>
+      </w:r>
+    </w:p>
+    <w:p>
+      <w:pPr>
+        <w:pStyle w:val="Heading2"/>
+      </w:pPr>
+      <w:r>
+        <w:rPr/>
+        <w:t xml:space="preserve">6.11 Cheaper tracing, measured reclaim, and an automatic I/O target</w:t>
+      </w:r>
+    </w:p>
+    <w:p>
+      <w:pPr>
+        <w:jc w:val="both"/>
+      </w:pPr>
+      <w:r>
+        <w:rPr/>
+        <w:t xml:space="preserve">Profiling the daemon on the real programs showed that prediction scored about 24 candidate files per open and computed a context score for each, although most could never reach the threshold. Since the context score is at most 1, a candidate whose sequence score is below (threshold - 0.4) / 0.6 cannot qualify and is now skipped; this changes no prediction (a unit test checks it), and with a cache of file extensions the cost per open fell from 125 to 37 microseconds under the profiler. Reporting only the first read of each file from the kernel, and close events only when eviction needs them (</w:t>
+      </w:r>
+      <w:r>
+        <w:rPr>
+          <w:rFonts w:ascii="Courier New" w:hAnsi="Courier New"/>
+        </w:rPr>
+        <w:t xml:space="preserve">--kernel-filter</w:t>
+      </w:r>
+      <w:r>
+        <w:rPr/>
+        <w:t xml:space="preserve">), changed little, because the cost comes from about 25,000 opens per second, mostly from grep. The remaining cost is removed by tracing only the programs that need prefetching, with an in-kernel allow-list of process names (</w:t>
+      </w:r>
+      <w:r>
+        <w:rPr>
+          <w:rFonts w:ascii="Courier New" w:hAnsi="Courier New"/>
+        </w:rPr>
+        <w:t xml:space="preserve">--only-comm</w:t>
+      </w:r>
+      <w:r>
+        <w:rPr/>
+        <w:t xml:space="preserve">). Mean time per operation, five runs:</w:t>
+      </w:r>
+    </w:p>
+    <w:tbl>
+      <w:tblPr>
+        <w:tblW w:w="0" w:type="auto"/>
+        <w:tblBorders>
+          <w:top w:val="single" w:sz="4" w:space="0" w:color="808080"/>
+          <w:left w:val="single" w:sz="4" w:space="0" w:color="808080"/>
+          <w:bottom w:val="single" w:sz="4" w:space="0" w:color="808080"/>
+          <w:right w:val="single" w:sz="4" w:space="0" w:color="808080"/>
+          <w:insideH w:val="single" w:sz="4" w:space="0" w:color="808080"/>
+          <w:insideV w:val="single" w:sz="4" w:space="0" w:color="808080"/>
+        </w:tblBorders>
+        <w:tblCellMar>
+          <w:left w:w="80" w:type="dxa"/>
+          <w:right w:w="80" w:type="dxa"/>
+        </w:tblCellMar>
+      </w:tblPr>
+      <w:tblGrid>
+        <w:gridCol w:w="3200"/>
+        <w:gridCol w:w="1500"/>
+        <w:gridCol w:w="2000"/>
+        <w:gridCol w:w="1500"/>
+      </w:tblGrid>
+      <w:tr>
+        <w:tc>
+          <w:tcPr>
+            <w:tcW w:w="3200" w:type="dxa"/>
+            <w:shd w:val="clear" w:color="auto" w:fill="D9E2F3"/>
+          </w:tcPr>
+          <w:p>
+            <w:pPr>
+              <w:spacing w:after="0"/>
+            </w:pPr>
+            <w:r>
+              <w:rPr>
+                <w:b/>
+                <w:sz w:val="19"/>
+              </w:rPr>
+              <w:t xml:space="preserve">Limit, configuration</w:t>
+            </w:r>
+          </w:p>
+        </w:tc>
+        <w:tc>
+          <w:tcPr>
+            <w:tcW w:w="1500" w:type="dxa"/>
+            <w:shd w:val="clear" w:color="auto" w:fill="D9E2F3"/>
+          </w:tcPr>
+          <w:p>
+            <w:pPr>
+              <w:spacing w:after="0"/>
+            </w:pPr>
+            <w:r>
+              <w:rPr>
+                <w:b/>
+                <w:sz w:val="19"/>
+              </w:rPr>
+              <w:t xml:space="preserve">Build (s)</w:t>
+            </w:r>
+          </w:p>
+        </w:tc>
+        <w:tc>
+          <w:tcPr>
+            <w:tcW w:w="2000" w:type="dxa"/>
+            <w:shd w:val="clear" w:color="auto" w:fill="D9E2F3"/>
+          </w:tcPr>
+          <w:p>
+            <w:pPr>
+              <w:spacing w:after="0"/>
+            </w:pPr>
+            <w:r>
+              <w:rPr>
+                <w:b/>
+                <w:sz w:val="19"/>
+              </w:rPr>
+              <w:t xml:space="preserve">Python start-up (ms)</w:t>
+            </w:r>
+          </w:p>
+        </w:tc>
+        <w:tc>
+          <w:tcPr>
+            <w:tcW w:w="1500" w:type="dxa"/>
+            <w:shd w:val="clear" w:color="auto" w:fill="D9E2F3"/>
+          </w:tcPr>
+          <w:p>
+            <w:pPr>
+              <w:spacing w:after="0"/>
+            </w:pPr>
+            <w:r>
+              <w:rPr>
+                <w:b/>
+                <w:sz w:val="19"/>
+              </w:rPr>
+              <w:t xml:space="preserve">Search (ms)</w:t>
+            </w:r>
+          </w:p>
+        </w:tc>
+      </w:tr>
+      <w:tr>
+        <w:tc>
+          <w:tcPr>
+            <w:tcW w:w="3200" w:type="dxa"/>
+          </w:tcPr>
+          <w:p>
+            <w:pPr>
+              <w:spacing w:after="0"/>
+            </w:pPr>
+            <w:r>
+              <w:rPr>
+                <w:sz w:val="19"/>
+              </w:rPr>
+              <w:t xml:space="preserve">300 MB, no daemon</w:t>
+            </w:r>
+          </w:p>
+        </w:tc>
+        <w:tc>
+          <w:tcPr>
+            <w:tcW w:w="1500" w:type="dxa"/>
+          </w:tcPr>
+          <w:p>
+            <w:pPr>
+              <w:spacing w:after="0"/>
+            </w:pPr>
+            <w:r>
+              <w:rPr>
+                <w:sz w:val="19"/>
+              </w:rPr>
+              <w:t xml:space="preserve">11.90</w:t>
+            </w:r>
+          </w:p>
+        </w:tc>
+        <w:tc>
+          <w:tcPr>
+            <w:tcW w:w="2000" w:type="dxa"/>
+          </w:tcPr>
+          <w:p>
+            <w:pPr>
+              <w:spacing w:after="0"/>
+            </w:pPr>
+            <w:r>
+              <w:rPr>
+                <w:sz w:val="19"/>
+              </w:rPr>
+              <w:t xml:space="preserve">61.6</w:t>
+            </w:r>
+          </w:p>
+        </w:tc>
+        <w:tc>
+          <w:tcPr>
+            <w:tcW w:w="1500" w:type="dxa"/>
+          </w:tcPr>
+          <w:p>
+            <w:pPr>
+              <w:spacing w:after="0"/>
+            </w:pPr>
+            <w:r>
+              <w:rPr>
+                <w:sz w:val="19"/>
+              </w:rPr>
+              <w:t xml:space="preserve">65.8</w:t>
+            </w:r>
+          </w:p>
+        </w:tc>
+      </w:tr>
+      <w:tr>
+        <w:tc>
+          <w:tcPr>
+            <w:tcW w:w="3200" w:type="dxa"/>
+          </w:tcPr>
+          <w:p>
+            <w:pPr>
+              <w:spacing w:after="0"/>
+            </w:pPr>
+            <w:r>
+              <w:rPr>
+                <w:sz w:val="19"/>
+              </w:rPr>
+              <w:t xml:space="preserve">300 MB, all programs + libraries</w:t>
+            </w:r>
+          </w:p>
+        </w:tc>
+        <w:tc>
+          <w:tcPr>
+            <w:tcW w:w="1500" w:type="dxa"/>
+          </w:tcPr>
+          <w:p>
+            <w:pPr>
+              <w:spacing w:after="0"/>
+            </w:pPr>
+            <w:r>
+              <w:rPr>
+                <w:sz w:val="19"/>
+              </w:rPr>
+              <w:t xml:space="preserve">14.08</w:t>
+            </w:r>
+          </w:p>
+        </w:tc>
+        <w:tc>
+          <w:tcPr>
+            <w:tcW w:w="2000" w:type="dxa"/>
+          </w:tcPr>
+          <w:p>
+            <w:pPr>
+              <w:spacing w:after="0"/>
+            </w:pPr>
+            <w:r>
+              <w:rPr>
+                <w:sz w:val="19"/>
+              </w:rPr>
+              <w:t xml:space="preserve">81.2</w:t>
+            </w:r>
+          </w:p>
+        </w:tc>
+        <w:tc>
+          <w:tcPr>
+            <w:tcW w:w="1500" w:type="dxa"/>
+          </w:tcPr>
+          <w:p>
+            <w:pPr>
+              <w:spacing w:after="0"/>
+            </w:pPr>
+            <w:r>
+              <w:rPr>
+                <w:sz w:val="19"/>
+              </w:rPr>
+              <w:t xml:space="preserve">124.9</w:t>
+            </w:r>
+          </w:p>
+        </w:tc>
+      </w:tr>
+      <w:tr>
+        <w:tc>
+          <w:tcPr>
+            <w:tcW w:w="3200" w:type="dxa"/>
+          </w:tcPr>
+          <w:p>
+            <w:pPr>
+              <w:spacing w:after="0"/>
+            </w:pPr>
+            <w:r>
+              <w:rPr>
+                <w:sz w:val="19"/>
+              </w:rPr>
+              <w:t xml:space="preserve">300 MB, all programs</w:t>
+            </w:r>
+          </w:p>
+        </w:tc>
+        <w:tc>
+          <w:tcPr>
+            <w:tcW w:w="1500" w:type="dxa"/>
+          </w:tcPr>
+          <w:p>
+            <w:pPr>
+              <w:spacing w:after="0"/>
+            </w:pPr>
+            <w:r>
+              <w:rPr>
+                <w:sz w:val="19"/>
+              </w:rPr>
+              <w:t xml:space="preserve">13.76</w:t>
+            </w:r>
+          </w:p>
+        </w:tc>
+        <w:tc>
+          <w:tcPr>
+            <w:tcW w:w="2000" w:type="dxa"/>
+          </w:tcPr>
+          <w:p>
+            <w:pPr>
+              <w:spacing w:after="0"/>
+            </w:pPr>
+            <w:r>
+              <w:rPr>
+                <w:sz w:val="19"/>
+              </w:rPr>
+              <w:t xml:space="preserve">78.3</w:t>
+            </w:r>
+          </w:p>
+        </w:tc>
+        <w:tc>
+          <w:tcPr>
+            <w:tcW w:w="1500" w:type="dxa"/>
+          </w:tcPr>
+          <w:p>
+            <w:pPr>
+              <w:spacing w:after="0"/>
+            </w:pPr>
+            <w:r>
+              <w:rPr>
+                <w:sz w:val="19"/>
+              </w:rPr>
+              <w:t xml:space="preserve">116.4</w:t>
+            </w:r>
+          </w:p>
+        </w:tc>
+      </w:tr>
+      <w:tr>
+        <w:tc>
+          <w:tcPr>
+            <w:tcW w:w="3200" w:type="dxa"/>
+          </w:tcPr>
+          <w:p>
+            <w:pPr>
+              <w:spacing w:after="0"/>
+            </w:pPr>
+            <w:r>
+              <w:rPr>
+                <w:sz w:val="19"/>
+              </w:rPr>
+              <w:t xml:space="preserve">300 MB, build only</w:t>
+            </w:r>
+          </w:p>
+        </w:tc>
+        <w:tc>
+          <w:tcPr>
+            <w:tcW w:w="1500" w:type="dxa"/>
+          </w:tcPr>
+          <w:p>
+            <w:pPr>
+              <w:spacing w:after="0"/>
+            </w:pPr>
+            <w:r>
+              <w:rPr>
+                <w:sz w:val="19"/>
+              </w:rPr>
+              <w:t xml:space="preserve">12.22</w:t>
+            </w:r>
+          </w:p>
+        </w:tc>
+        <w:tc>
+          <w:tcPr>
+            <w:tcW w:w="2000" w:type="dxa"/>
+          </w:tcPr>
+          <w:p>
+            <w:pPr>
+              <w:spacing w:after="0"/>
+            </w:pPr>
+            <w:r>
+              <w:rPr>
+                <w:sz w:val="19"/>
+              </w:rPr>
+              <w:t xml:space="preserve">61.5</w:t>
+            </w:r>
+          </w:p>
+        </w:tc>
+        <w:tc>
+          <w:tcPr>
+            <w:tcW w:w="1500" w:type="dxa"/>
+          </w:tcPr>
+          <w:p>
+            <w:pPr>
+              <w:spacing w:after="0"/>
+            </w:pPr>
+            <w:r>
+              <w:rPr>
+                <w:sz w:val="19"/>
+              </w:rPr>
+              <w:t xml:space="preserve">68.1</w:t>
+            </w:r>
+          </w:p>
+        </w:tc>
+      </w:tr>
+      <w:tr>
+        <w:tc>
+          <w:tcPr>
+            <w:tcW w:w="3200" w:type="dxa"/>
+          </w:tcPr>
+          <w:p>
+            <w:pPr>
+              <w:spacing w:after="0"/>
+            </w:pPr>
+            <w:r>
+              <w:rPr>
+                <w:sz w:val="19"/>
+              </w:rPr>
+              <w:t xml:space="preserve">No limit, no daemon</w:t>
+            </w:r>
+          </w:p>
+        </w:tc>
+        <w:tc>
+          <w:tcPr>
+            <w:tcW w:w="1500" w:type="dxa"/>
+          </w:tcPr>
+          <w:p>
+            <w:pPr>
+              <w:spacing w:after="0"/>
+            </w:pPr>
+            <w:r>
+              <w:rPr>
+                <w:sz w:val="19"/>
+              </w:rPr>
+              <w:t xml:space="preserve">12.10</w:t>
+            </w:r>
+          </w:p>
+        </w:tc>
+        <w:tc>
+          <w:tcPr>
+            <w:tcW w:w="2000" w:type="dxa"/>
+          </w:tcPr>
+          <w:p>
+            <w:pPr>
+              <w:spacing w:after="0"/>
+            </w:pPr>
+            <w:r>
+              <w:rPr>
+                <w:sz w:val="19"/>
+              </w:rPr>
+              <w:t xml:space="preserve">63.0</w:t>
+            </w:r>
+          </w:p>
+        </w:tc>
+        <w:tc>
+          <w:tcPr>
+            <w:tcW w:w="1500" w:type="dxa"/>
+          </w:tcPr>
+          <w:p>
+            <w:pPr>
+              <w:spacing w:after="0"/>
+            </w:pPr>
+            <w:r>
+              <w:rPr>
+                <w:sz w:val="19"/>
+              </w:rPr>
+              <w:t xml:space="preserve">67.0</w:t>
+            </w:r>
+          </w:p>
+        </w:tc>
+      </w:tr>
+      <w:tr>
+        <w:tc>
+          <w:tcPr>
+            <w:tcW w:w="3200" w:type="dxa"/>
+          </w:tcPr>
+          <w:p>
+            <w:pPr>
+              <w:spacing w:after="0"/>
+            </w:pPr>
+            <w:r>
+              <w:rPr>
+                <w:sz w:val="19"/>
+              </w:rPr>
+              <w:t xml:space="preserve">No limit, all programs + libraries</w:t>
+            </w:r>
+          </w:p>
+        </w:tc>
+        <w:tc>
+          <w:tcPr>
+            <w:tcW w:w="1500" w:type="dxa"/>
+          </w:tcPr>
+          <w:p>
+            <w:pPr>
+              <w:spacing w:after="0"/>
+            </w:pPr>
+            <w:r>
+              <w:rPr>
+                <w:sz w:val="19"/>
+              </w:rPr>
+              <w:t xml:space="preserve">12.66</w:t>
+            </w:r>
+          </w:p>
+        </w:tc>
+        <w:tc>
+          <w:tcPr>
+            <w:tcW w:w="2000" w:type="dxa"/>
+          </w:tcPr>
+          <w:p>
+            <w:pPr>
+              <w:spacing w:after="0"/>
+            </w:pPr>
+            <w:r>
+              <w:rPr>
+                <w:sz w:val="19"/>
+              </w:rPr>
+              <w:t xml:space="preserve">69.6</w:t>
+            </w:r>
+          </w:p>
+        </w:tc>
+        <w:tc>
+          <w:tcPr>
+            <w:tcW w:w="1500" w:type="dxa"/>
+          </w:tcPr>
+          <w:p>
+            <w:pPr>
+              <w:spacing w:after="0"/>
+            </w:pPr>
+            <w:r>
+              <w:rPr>
+                <w:sz w:val="19"/>
+              </w:rPr>
+              <w:t xml:space="preserve">71.9</w:t>
+            </w:r>
+          </w:p>
+        </w:tc>
+      </w:tr>
+      <w:tr>
+        <w:tc>
+          <w:tcPr>
+            <w:tcW w:w="3200" w:type="dxa"/>
+          </w:tcPr>
+          <w:p>
+            <w:pPr>
+              <w:spacing w:after="0"/>
+            </w:pPr>
+            <w:r>
+              <w:rPr>
+                <w:sz w:val="19"/>
+              </w:rPr>
+              <w:t xml:space="preserve">No limit, all programs</w:t>
+            </w:r>
+          </w:p>
+        </w:tc>
+        <w:tc>
+          <w:tcPr>
+            <w:tcW w:w="1500" w:type="dxa"/>
+          </w:tcPr>
+          <w:p>
+            <w:pPr>
+              <w:spacing w:after="0"/>
+            </w:pPr>
+            <w:r>
+              <w:rPr>
+                <w:sz w:val="19"/>
+              </w:rPr>
+              <w:t xml:space="preserve">12.83</w:t>
+            </w:r>
+          </w:p>
+        </w:tc>
+        <w:tc>
+          <w:tcPr>
+            <w:tcW w:w="2000" w:type="dxa"/>
+          </w:tcPr>
+          <w:p>
+            <w:pPr>
+              <w:spacing w:after="0"/>
+            </w:pPr>
+            <w:r>
+              <w:rPr>
+                <w:sz w:val="19"/>
+              </w:rPr>
+              <w:t xml:space="preserve">69.6</w:t>
+            </w:r>
+          </w:p>
+        </w:tc>
+        <w:tc>
+          <w:tcPr>
+            <w:tcW w:w="1500" w:type="dxa"/>
+          </w:tcPr>
+          <w:p>
+            <w:pPr>
+              <w:spacing w:after="0"/>
+            </w:pPr>
+            <w:r>
+              <w:rPr>
+                <w:sz w:val="19"/>
+              </w:rPr>
+              <w:t xml:space="preserve">74.7</w:t>
+            </w:r>
+          </w:p>
+        </w:tc>
+      </w:tr>
+      <w:tr>
+        <w:tc>
+          <w:tcPr>
+            <w:tcW w:w="3200" w:type="dxa"/>
+          </w:tcPr>
+          <w:p>
+            <w:pPr>
+              <w:spacing w:after="0"/>
+            </w:pPr>
+            <w:r>
+              <w:rPr>
+                <w:sz w:val="19"/>
+              </w:rPr>
+              <w:t xml:space="preserve">No limit, build only</w:t>
+            </w:r>
+          </w:p>
+        </w:tc>
+        <w:tc>
+          <w:tcPr>
+            <w:tcW w:w="1500" w:type="dxa"/>
+          </w:tcPr>
+          <w:p>
+            <w:pPr>
+              <w:spacing w:after="0"/>
+            </w:pPr>
+            <w:r>
+              <w:rPr>
+                <w:sz w:val="19"/>
+              </w:rPr>
+              <w:t xml:space="preserve">12.68</w:t>
+            </w:r>
+          </w:p>
+        </w:tc>
+        <w:tc>
+          <w:tcPr>
+            <w:tcW w:w="2000" w:type="dxa"/>
+          </w:tcPr>
+          <w:p>
+            <w:pPr>
+              <w:spacing w:after="0"/>
+            </w:pPr>
+            <w:r>
+              <w:rPr>
+                <w:sz w:val="19"/>
+              </w:rPr>
+              <w:t xml:space="preserve">65.7</w:t>
+            </w:r>
+          </w:p>
+        </w:tc>
+        <w:tc>
+          <w:tcPr>
+            <w:tcW w:w="1500" w:type="dxa"/>
+          </w:tcPr>
+          <w:p>
+            <w:pPr>
+              <w:spacing w:after="0"/>
+            </w:pPr>
+            <w:r>
+              <w:rPr>
+                <w:sz w:val="19"/>
+              </w:rPr>
+              <w:t xml:space="preserve">65.1</w:t>
+            </w:r>
+          </w:p>
+        </w:tc>
+      </w:tr>
+    </w:tbl>
+    <w:p/>
+    <w:p>
+      <w:pPr>
+        <w:jc w:val="both"/>
+      </w:pPr>
+      <w:r>
+        <w:rPr/>
+        <w:t xml:space="preserve">Tracing every program still slowed them (at 300 MB: build +16% (95% CI +6% to +25%, p = 0.006), search +77% (95% CI +60% to +94%, p &lt; 0.001)). Tracing only the build removed the cost for everything else: at 300 MB no program was significantly slower (build +3% (95% CI -6% to +11%, p = 0.451), search +3% (95% CI -3% to +10%, p = 0.239)), and without a limit only the traced build paid (+5% (95% CI +1% to +9%, p = 0.027)).</w:t>
+      </w:r>
+    </w:p>
+    <w:p>
+      <w:pPr>
+        <w:jc w:val="both"/>
+      </w:pPr>
+      <w:r>
+        <w:rPr/>
+        <w:t xml:space="preserve">The harness now records the kernel's reclaim activity in each run. Under memory pressure, reclaim scanned about 10.3 million pages in a 40-second run without the daemon, 14.3 million with it, and 0.7 million with dead-file eviction: -95% (95% CI -97% to -94%, p &lt; 0.001) against the plain daemon. Direct-reclaim stalls, in which the reading process itself has to free memory, fell from 222 per run to none. Throughput again improved: +4% (95% CI +3% to +6%, p &lt; 0.001). This confirms why dead-file eviction helps.</w:t>
+      </w:r>
+    </w:p>
+    <w:p>
+      <w:pPr>
+        <w:jc w:val="both"/>
+      </w:pPr>
+      <w:r>
+        <w:rPr/>
+        <w:t xml:space="preserve">An automatic target for the adaptive I/O limit (</w:t>
+      </w:r>
+      <w:r>
+        <w:rPr>
+          <w:rFonts w:ascii="Courier New" w:hAnsi="Courier New"/>
+        </w:rPr>
+        <w:t xml:space="preserve">--adaptive-io auto</w:t>
+      </w:r>
+      <w:r>
+        <w:rPr/>
+        <w:t xml:space="preserve">) did not work. Every 10 seconds it paused prefetching for 1.5 seconds, measured the stall the workload caused on its own (0.62 on the busy slow disk), and aimed 0.1 above it. It then cut its window only 16 times in 176 checks, and the tail cost stayed (p99 +94% (95% CI +93% to +96%, p &lt; 0.001) against no daemon). On a disk that is busy most of the time, the share of time some task is stalled is near its limit with or without prefetching; extra prefetch reads make each read wait longer without raising that share much. Protecting the tail needs a per-read latency signal.</w:t>
       </w:r>
     </w:p>
     <w:p>

</xml_diff>